<commit_message>
Add PD2 gold handoff
</commit_message>
<xml_diff>
--- a/PD1_Technical_Report.docx
+++ b/PD1_Technical_Report.docx
@@ -10145,6 +10145,4288 @@
       </w:r>
     </w:p>
     <w:p/>
+    <w:p>
+      <w:pPr>
+        <w:pStyle w:val="Heading1"/>
+      </w:pPr>
+      <w:r>
+        <w:t xml:space="preserve">5. Gold Layer (PD2)</w:t>
+      </w:r>
+    </w:p>
+    <w:p>
+      <w:pPr>
+        <w:pStyle w:val="Heading2"/>
+      </w:pPr>
+      <w:r>
+        <w:t xml:space="preserve">5.1 Gold Layer Technical Work</w:t>
+      </w:r>
+    </w:p>
+    <w:p>
+      <w:r>
+        <w:t xml:space="preserve">The PD2 implementation completes the Medallion Architecture by creating a physical Gold schema in SQL Server. The Gold layer is implemented with SQL tables, identity surrogate keys, primary keys, unique natural-key constraints on dimensions, and explicit foreign-key constraints from fact tables to dimensions. The implementation files are Scripts/Gold/ddl_gold.sql, Scripts/Gold/proc_load_gold.sql, and Scripts/Gold/validate_gold.sql.</w:t>
+      </w:r>
+    </w:p>
+    <w:p>
+      <w:r>
+        <w:t xml:space="preserve">The Gold layer is modeled as a Galaxy Schema, also called a Fact Constellation, because multiple fact tables share conformed dimensions. The shared dimensions are gold.dim_date, gold.dim_customer, gold.dim_product, and gold.dim_promotion.</w:t>
+      </w:r>
+    </w:p>
+    <w:p>
+      <w:pPr>
+        <w:pStyle w:val="Heading2"/>
+      </w:pPr>
+      <w:r>
+        <w:t xml:space="preserve">5.2 Business Process 1: Store Sales Performance</w:t>
+      </w:r>
+    </w:p>
+    <w:p>
+      <w:r>
+        <w:t xml:space="preserve">Business process: in-store POS sales performance across physical stores, employees, customers, products, and promotions.</w:t>
+      </w:r>
+    </w:p>
+    <w:p>
+      <w:r>
+        <w:t xml:space="preserve">Grain: one row per POS transaction line item from silver.transaction_items, enriched with the POS transaction header from silver.pos_transactions.</w:t>
+      </w:r>
+    </w:p>
+    <w:p>
+      <w:r>
+        <w:t xml:space="preserve">- Fact table: gold.fact_store_sales</w:t>
+      </w:r>
+    </w:p>
+    <w:p>
+      <w:r>
+        <w:t xml:space="preserve">- Dimensions: gold.dim_date, gold.dim_store, gold.dim_product, gold.dim_customer, gold.dim_employee, gold.dim_promotion</w:t>
+      </w:r>
+    </w:p>
+    <w:p>
+      <w:r>
+        <w:t xml:space="preserve">- Measures: quantity, unit_price, gross_sales_amount, discount_percent, discount_amount, net_sales_amount</w:t>
+      </w:r>
+    </w:p>
+    <w:p>
+      <w:r>
+        <w:t xml:space="preserve">- Degenerate identifiers retained for traceability: line_id and transaction_id</w:t>
+      </w:r>
+    </w:p>
+    <w:p>
+      <w:pPr>
+        <w:pStyle w:val="Heading2"/>
+      </w:pPr>
+      <w:r>
+        <w:t xml:space="preserve">5.3 Business Process 2: Online Sales Performance</w:t>
+      </w:r>
+    </w:p>
+    <w:p>
+      <w:r>
+        <w:t xml:space="preserve">Business process: online sales performance across e-commerce orders, customers, products, warehouses, and promotions.</w:t>
+      </w:r>
+    </w:p>
+    <w:p>
+      <w:r>
+        <w:t xml:space="preserve">Grain: one row per online order line item from silver.online_order_items, enriched with online order header data from silver.online_orders.</w:t>
+      </w:r>
+    </w:p>
+    <w:p>
+      <w:r>
+        <w:t xml:space="preserve">- Fact table: gold.fact_online_sales</w:t>
+      </w:r>
+    </w:p>
+    <w:p>
+      <w:r>
+        <w:t xml:space="preserve">- Dimensions: gold.dim_date, gold.dim_customer, gold.dim_product, gold.dim_warehouse, gold.dim_promotion, gold.dim_order_status, gold.dim_payment_method</w:t>
+      </w:r>
+    </w:p>
+    <w:p>
+      <w:r>
+        <w:t xml:space="preserve">- Measures: quantity, unit_price, gross_sales_amount, discount_percent, discount_amount, net_sales_amount, order_total</w:t>
+      </w:r>
+    </w:p>
+    <w:p>
+      <w:r>
+        <w:t xml:space="preserve">- Degenerate identifiers retained for traceability: order_item_id and order_id</w:t>
+      </w:r>
+    </w:p>
+    <w:p>
+      <w:pPr>
+        <w:pStyle w:val="Heading2"/>
+      </w:pPr>
+      <w:r>
+        <w:t xml:space="preserve">5.4 Dimension and Fact Table Explanation</w:t>
+      </w:r>
+    </w:p>
+    <w:p>
+      <w:r>
+        <w:t xml:space="preserve">- gold.dim_date stores reusable calendar attributes such as day, month, quarter, year, weekday name, and weekend flag.</w:t>
+      </w:r>
+    </w:p>
+    <w:p>
+      <w:r>
+        <w:t xml:space="preserve">- gold.dim_customer stores cleaned customer profile attributes from Silver and includes Customer_ID = 0 for anonymous or missing customers.</w:t>
+      </w:r>
+    </w:p>
+    <w:p>
+      <w:r>
+        <w:t xml:space="preserve">- gold.dim_product stores product, SKU, brand, department, and package-size attributes.</w:t>
+      </w:r>
+    </w:p>
+    <w:p>
+      <w:r>
+        <w:t xml:space="preserve">- gold.dim_promotion stores campaign type, discount percentage, dates, and duration, with Promotion_ID = 0 representing no promotion.</w:t>
+      </w:r>
+    </w:p>
+    <w:p>
+      <w:r>
+        <w:t xml:space="preserve">- gold.dim_store describes physical retail stores for the Store Sales star.</w:t>
+      </w:r>
+    </w:p>
+    <w:p>
+      <w:r>
+        <w:t xml:space="preserve">- gold.dim_employee describes store employees for the Store Sales star.</w:t>
+      </w:r>
+    </w:p>
+    <w:p>
+      <w:r>
+        <w:t xml:space="preserve">- gold.dim_warehouse describes fulfillment warehouses for the Online Sales star.</w:t>
+      </w:r>
+    </w:p>
+    <w:p>
+      <w:r>
+        <w:t xml:space="preserve">- gold.dim_order_status stores standardized online order statuses such as Delivered, Pending, Cancelled, and Shipped.</w:t>
+      </w:r>
+    </w:p>
+    <w:p>
+      <w:r>
+        <w:t xml:space="preserve">- gold.dim_payment_method stores online payment methods used by customers.</w:t>
+      </w:r>
+    </w:p>
+    <w:p>
+      <w:r>
+        <w:t xml:space="preserve">- gold.fact_store_sales and gold.fact_online_sales store additive sales measures at line-item grain and reference dimensions only through surrogate keys. Online Sales also references order status and payment method dimensions through surrogate keys.</w:t>
+      </w:r>
+    </w:p>
+    <w:p>
+      <w:pPr>
+        <w:pStyle w:val="Heading2"/>
+      </w:pPr>
+      <w:r>
+        <w:t xml:space="preserve">5.5 Conformed Dimensions</w:t>
+      </w:r>
+    </w:p>
+    <w:p>
+      <w:r>
+        <w:t xml:space="preserve">The dimensions gold.dim_date, gold.dim_customer, gold.dim_product, and gold.dim_promotion are conformed dimensions because both fact tables reference the same physical dimension tables. This allows Store Sales and Online Sales to be compared consistently by date, customer, product, and promotion without duplicating dimensional definitions.</w:t>
+      </w:r>
+    </w:p>
+    <w:p>
+      <w:pPr>
+        <w:pStyle w:val="Heading2"/>
+      </w:pPr>
+      <w:r>
+        <w:t xml:space="preserve">5.6 Surrogate Key Design</w:t>
+      </w:r>
+    </w:p>
+    <w:p>
+      <w:r>
+        <w:t xml:space="preserve">Every Gold dimension has an integer identity surrogate key as the primary key, for example customer_key, product_key, and promotion_key. Every fact table also has its own identity surrogate primary key. Facts store dimension surrogate keys instead of operational natural keys, while source identifiers such as line_id, transaction_id, order_item_id, and order_id are retained only for traceability.</w:t>
+      </w:r>
+    </w:p>
+    <w:p>
+      <w:pPr>
+        <w:pStyle w:val="Heading2"/>
+      </w:pPr>
+      <w:r>
+        <w:t xml:space="preserve">5.7 Referential Consistency</w:t>
+      </w:r>
+    </w:p>
+    <w:p>
+      <w:r>
+        <w:t xml:space="preserve">The DDL defines explicit foreign-key constraints from each fact table to its dimensions. The load procedure creates unknown or default dimension members before loading facts, such as Customer_ID = 0, Product_ID = 0, Store_ID = 0, Warehouse_ID = 0, Employee_ID = 0, Promotion_ID = 0, and Date = 1900-01-01. This prevents null surrogate keys in fact tables and keeps referential consistency even when a source row has missing optional references.</w:t>
+      </w:r>
+    </w:p>
+    <w:p>
+      <w:pPr>
+        <w:pStyle w:val="Heading2"/>
+      </w:pPr>
+      <w:r>
+        <w:t xml:space="preserve">5.8 Gold Validation and Audit Evidence</w:t>
+      </w:r>
+    </w:p>
+    <w:p>
+      <w:r>
+        <w:t xml:space="preserve">Gold validation is performed with Scripts/Gold/validate_gold.sql. The validation checks row counts, null fact foreign keys, duplicate natural keys in dimensions, fact-to-dimension joins, Silver-to-Gold fact grain counts, and conformed dimensions. The official PD2 audit script, Scripts/PD2-SubmissionScript-Final.sql, must be run live in SSMS on the actual SQL Server database after executing gold.load_gold.</w:t>
+      </w:r>
+    </w:p>
+    <w:p>
+      <w:r>
+        <w:t xml:space="preserve">- Required screenshot: SQL Server Gold schema or database diagram showing dimensions, facts, primary keys, and foreign keys.</w:t>
+      </w:r>
+    </w:p>
+    <w:p>
+      <w:r>
+        <w:t xml:space="preserve">- Required screenshot: PD2 audit script Results tab.</w:t>
+      </w:r>
+    </w:p>
+    <w:p>
+      <w:r>
+        <w:t xml:space="preserve">- Required screenshot: PD2 audit script Messages tab, including the generated anti-plagiarism token.</w:t>
+      </w:r>
+    </w:p>
+    <w:p>
+      <w:pPr>
+        <w:pStyle w:val="Heading2"/>
+      </w:pPr>
+      <w:r>
+        <w:t xml:space="preserve">5.9 Gold SQL Script Appendix</w:t>
+      </w:r>
+    </w:p>
+    <w:p>
+      <w:r>
+        <w:t xml:space="preserve">The Gold SQL appendix is included below and the same scripts are submitted as separate files. Scripts/Gold/ddl_gold.sql creates the gold schema, dimensions, facts, primary keys, unique constraints, and foreign keys. Scripts/Gold/proc_load_gold.sql loads all Gold dimension and fact tables from Silver. Scripts/Gold/validate_gold.sql contains pre-submission validation queries. Scripts/PD2-SubmissionScript-Final.sql is the official audit script and should be executed in SSMS after validation passes.</w:t>
+      </w:r>
+    </w:p>
+    <w:p>
+      <w:pPr>
+        <w:pStyle w:val="Heading1"/>
+      </w:pPr>
+      <w:r>
+        <w:t xml:space="preserve">6. Gold SQL Script Appendix</w:t>
+      </w:r>
+    </w:p>
+    <w:p>
+      <w:pPr>
+        <w:pStyle w:val="Heading2"/>
+      </w:pPr>
+      <w:r>
+        <w:t xml:space="preserve">Appendix A: Scripts/Gold/ddl_gold.sql</w:t>
+      </w:r>
+    </w:p>
+    <w:p>
+      <w:r>
+        <w:t xml:space="preserve">/*</w:t>
+      </w:r>
+    </w:p>
+    <w:p>
+      <w:r>
+        <w:t xml:space="preserve">===============================================================================</w:t>
+      </w:r>
+    </w:p>
+    <w:p>
+      <w:r>
+        <w:t xml:space="preserve">DDL Script: ddl_gold.sql</w:t>
+      </w:r>
+    </w:p>
+    <w:p>
+      <w:r>
+        <w:t xml:space="preserve">Purpose:    Creates the Gold dimensional layer as a Galaxy Schema.</w:t>
+      </w:r>
+    </w:p>
+    <w:p>
+      <w:r>
+        <w:t xml:space="preserve">            Star 1: Store Sales Performance</w:t>
+      </w:r>
+    </w:p>
+    <w:p>
+      <w:r>
+        <w:t xml:space="preserve">            Star 2: Online Sales Performance</w:t>
+      </w:r>
+    </w:p>
+    <w:p>
+      <w:r>
+        <w:t xml:space="preserve">Run order:  After silver.load_silver has completed successfully.</w:t>
+      </w:r>
+    </w:p>
+    <w:p>
+      <w:r>
+        <w:t xml:space="preserve">===============================================================================</w:t>
+      </w:r>
+    </w:p>
+    <w:p>
+      <w:r>
+        <w:t xml:space="preserve">*/</w:t>
+      </w:r>
+    </w:p>
+    <w:p>
+      <w:r>
+        <w:t xml:space="preserve"/>
+      </w:r>
+    </w:p>
+    <w:p>
+      <w:r>
+        <w:t xml:space="preserve">USE DataWarehouse;</w:t>
+      </w:r>
+    </w:p>
+    <w:p>
+      <w:r>
+        <w:t xml:space="preserve">GO</w:t>
+      </w:r>
+    </w:p>
+    <w:p>
+      <w:r>
+        <w:t xml:space="preserve"/>
+      </w:r>
+    </w:p>
+    <w:p>
+      <w:r>
+        <w:t xml:space="preserve">IF NOT EXISTS (SELECT 1 FROM sys.schemas WHERE name = 'gold')</w:t>
+      </w:r>
+    </w:p>
+    <w:p>
+      <w:r>
+        <w:t xml:space="preserve">BEGIN</w:t>
+      </w:r>
+    </w:p>
+    <w:p>
+      <w:r>
+        <w:t xml:space="preserve">    EXEC('CREATE SCHEMA gold');</w:t>
+      </w:r>
+    </w:p>
+    <w:p>
+      <w:r>
+        <w:t xml:space="preserve">END;</w:t>
+      </w:r>
+    </w:p>
+    <w:p>
+      <w:r>
+        <w:t xml:space="preserve">GO</w:t>
+      </w:r>
+    </w:p>
+    <w:p>
+      <w:r>
+        <w:t xml:space="preserve"/>
+      </w:r>
+    </w:p>
+    <w:p>
+      <w:r>
+        <w:t xml:space="preserve">-- ============================================================</w:t>
+      </w:r>
+    </w:p>
+    <w:p>
+      <w:r>
+        <w:t xml:space="preserve">-- DROP EXISTING GOLD TABLES</w:t>
+      </w:r>
+    </w:p>
+    <w:p>
+      <w:r>
+        <w:t xml:space="preserve">-- Facts first because they hold foreign keys to dimensions.</w:t>
+      </w:r>
+    </w:p>
+    <w:p>
+      <w:r>
+        <w:t xml:space="preserve">-- ============================================================</w:t>
+      </w:r>
+    </w:p>
+    <w:p>
+      <w:r>
+        <w:t xml:space="preserve">IF OBJECT_ID('gold.fact_online_sales', 'U') IS NOT NULL DROP TABLE gold.fact_online_sales;</w:t>
+      </w:r>
+    </w:p>
+    <w:p>
+      <w:r>
+        <w:t xml:space="preserve">IF OBJECT_ID('gold.fact_store_sales',  'U') IS NOT NULL DROP TABLE gold.fact_store_sales;</w:t>
+      </w:r>
+    </w:p>
+    <w:p>
+      <w:r>
+        <w:t xml:space="preserve"/>
+      </w:r>
+    </w:p>
+    <w:p>
+      <w:r>
+        <w:t xml:space="preserve">IF OBJECT_ID('gold.dim_payment_method', 'U') IS NOT NULL DROP TABLE gold.dim_payment_method;</w:t>
+      </w:r>
+    </w:p>
+    <w:p>
+      <w:r>
+        <w:t xml:space="preserve">IF OBJECT_ID('gold.dim_order_status',   'U') IS NOT NULL DROP TABLE gold.dim_order_status;</w:t>
+      </w:r>
+    </w:p>
+    <w:p>
+      <w:r>
+        <w:t xml:space="preserve">IF OBJECT_ID('gold.dim_warehouse', 'U') IS NOT NULL DROP TABLE gold.dim_warehouse;</w:t>
+      </w:r>
+    </w:p>
+    <w:p>
+      <w:r>
+        <w:t xml:space="preserve">IF OBJECT_ID('gold.dim_employee',  'U') IS NOT NULL DROP TABLE gold.dim_employee;</w:t>
+      </w:r>
+    </w:p>
+    <w:p>
+      <w:r>
+        <w:t xml:space="preserve">IF OBJECT_ID('gold.dim_store',     'U') IS NOT NULL DROP TABLE gold.dim_store;</w:t>
+      </w:r>
+    </w:p>
+    <w:p>
+      <w:r>
+        <w:t xml:space="preserve">IF OBJECT_ID('gold.dim_promotion', 'U') IS NOT NULL DROP TABLE gold.dim_promotion;</w:t>
+      </w:r>
+    </w:p>
+    <w:p>
+      <w:r>
+        <w:t xml:space="preserve">IF OBJECT_ID('gold.dim_product',   'U') IS NOT NULL DROP TABLE gold.dim_product;</w:t>
+      </w:r>
+    </w:p>
+    <w:p>
+      <w:r>
+        <w:t xml:space="preserve">IF OBJECT_ID('gold.dim_customer',  'U') IS NOT NULL DROP TABLE gold.dim_customer;</w:t>
+      </w:r>
+    </w:p>
+    <w:p>
+      <w:r>
+        <w:t xml:space="preserve">IF OBJECT_ID('gold.dim_date',      'U') IS NOT NULL DROP TABLE gold.dim_date;</w:t>
+      </w:r>
+    </w:p>
+    <w:p>
+      <w:r>
+        <w:t xml:space="preserve">GO</w:t>
+      </w:r>
+    </w:p>
+    <w:p>
+      <w:r>
+        <w:t xml:space="preserve"/>
+      </w:r>
+    </w:p>
+    <w:p>
+      <w:r>
+        <w:t xml:space="preserve">-- ============================================================</w:t>
+      </w:r>
+    </w:p>
+    <w:p>
+      <w:r>
+        <w:t xml:space="preserve">-- CONFORMED DIMENSIONS</w:t>
+      </w:r>
+    </w:p>
+    <w:p>
+      <w:r>
+        <w:t xml:space="preserve">-- ============================================================</w:t>
+      </w:r>
+    </w:p>
+    <w:p>
+      <w:r>
+        <w:t xml:space="preserve">CREATE TABLE gold.dim_date (</w:t>
+      </w:r>
+    </w:p>
+    <w:p>
+      <w:r>
+        <w:t xml:space="preserve">    date_key              INT IDENTITY(1,1) NOT NULL,</w:t>
+      </w:r>
+    </w:p>
+    <w:p>
+      <w:r>
+        <w:t xml:space="preserve">    full_date             DATE              NOT NULL,</w:t>
+      </w:r>
+    </w:p>
+    <w:p>
+      <w:r>
+        <w:t xml:space="preserve">    day_number            TINYINT           NOT NULL,</w:t>
+      </w:r>
+    </w:p>
+    <w:p>
+      <w:r>
+        <w:t xml:space="preserve">    month_number          TINYINT           NOT NULL,</w:t>
+      </w:r>
+    </w:p>
+    <w:p>
+      <w:r>
+        <w:t xml:space="preserve">    month_name            NVARCHAR(20)      NOT NULL,</w:t>
+      </w:r>
+    </w:p>
+    <w:p>
+      <w:r>
+        <w:t xml:space="preserve">    quarter_number        TINYINT           NOT NULL,</w:t>
+      </w:r>
+    </w:p>
+    <w:p>
+      <w:r>
+        <w:t xml:space="preserve">    year_number           SMALLINT          NOT NULL,</w:t>
+      </w:r>
+    </w:p>
+    <w:p>
+      <w:r>
+        <w:t xml:space="preserve">    day_of_week_number    TINYINT           NOT NULL,</w:t>
+      </w:r>
+    </w:p>
+    <w:p>
+      <w:r>
+        <w:t xml:space="preserve">    day_name              NVARCHAR(20)      NOT NULL,</w:t>
+      </w:r>
+    </w:p>
+    <w:p>
+      <w:r>
+        <w:t xml:space="preserve">    is_weekend            BIT               NOT NULL,</w:t>
+      </w:r>
+    </w:p>
+    <w:p>
+      <w:r>
+        <w:t xml:space="preserve">    CONSTRAINT pk_dim_date PRIMARY KEY (date_key),</w:t>
+      </w:r>
+    </w:p>
+    <w:p>
+      <w:r>
+        <w:t xml:space="preserve">    CONSTRAINT uq_dim_date_full_date UNIQUE (full_date)</w:t>
+      </w:r>
+    </w:p>
+    <w:p>
+      <w:r>
+        <w:t xml:space="preserve">);</w:t>
+      </w:r>
+    </w:p>
+    <w:p>
+      <w:r>
+        <w:t xml:space="preserve"/>
+      </w:r>
+    </w:p>
+    <w:p>
+      <w:r>
+        <w:t xml:space="preserve">CREATE TABLE gold.dim_customer (</w:t>
+      </w:r>
+    </w:p>
+    <w:p>
+      <w:r>
+        <w:t xml:space="preserve">    customer_key      INT IDENTITY(1,1) NOT NULL,</w:t>
+      </w:r>
+    </w:p>
+    <w:p>
+      <w:r>
+        <w:t xml:space="preserve">    customer_id       INT               NOT NULL,</w:t>
+      </w:r>
+    </w:p>
+    <w:p>
+      <w:r>
+        <w:t xml:space="preserve">    first_name        NVARCHAR(100)     NOT NULL,</w:t>
+      </w:r>
+    </w:p>
+    <w:p>
+      <w:r>
+        <w:t xml:space="preserve">    last_name         NVARCHAR(100)     NOT NULL,</w:t>
+      </w:r>
+    </w:p>
+    <w:p>
+      <w:r>
+        <w:t xml:space="preserve">    full_name         NVARCHAR(200)     NOT NULL,</w:t>
+      </w:r>
+    </w:p>
+    <w:p>
+      <w:r>
+        <w:t xml:space="preserve">    gender            NVARCHAR(10)      NOT NULL,</w:t>
+      </w:r>
+    </w:p>
+    <w:p>
+      <w:r>
+        <w:t xml:space="preserve">    city              NVARCHAR(100)     NULL,</w:t>
+      </w:r>
+    </w:p>
+    <w:p>
+      <w:r>
+        <w:t xml:space="preserve">    loyalty_level     NVARCHAR(20)      NULL,</w:t>
+      </w:r>
+    </w:p>
+    <w:p>
+      <w:r>
+        <w:t xml:space="preserve">    email             NVARCHAR(200)     NULL,</w:t>
+      </w:r>
+    </w:p>
+    <w:p>
+      <w:r>
+        <w:t xml:space="preserve">    CONSTRAINT pk_dim_customer PRIMARY KEY (customer_key),</w:t>
+      </w:r>
+    </w:p>
+    <w:p>
+      <w:r>
+        <w:t xml:space="preserve">    CONSTRAINT uq_dim_customer_customer_id UNIQUE (customer_id)</w:t>
+      </w:r>
+    </w:p>
+    <w:p>
+      <w:r>
+        <w:t xml:space="preserve">);</w:t>
+      </w:r>
+    </w:p>
+    <w:p>
+      <w:r>
+        <w:t xml:space="preserve"/>
+      </w:r>
+    </w:p>
+    <w:p>
+      <w:r>
+        <w:t xml:space="preserve">CREATE TABLE gold.dim_product (</w:t>
+      </w:r>
+    </w:p>
+    <w:p>
+      <w:r>
+        <w:t xml:space="preserve">    product_key       INT IDENTITY(1,1) NOT NULL,</w:t>
+      </w:r>
+    </w:p>
+    <w:p>
+      <w:r>
+        <w:t xml:space="preserve">    product_id        INT               NOT NULL,</w:t>
+      </w:r>
+    </w:p>
+    <w:p>
+      <w:r>
+        <w:t xml:space="preserve">    sku               NVARCHAR(50)      NOT NULL,</w:t>
+      </w:r>
+    </w:p>
+    <w:p>
+      <w:r>
+        <w:t xml:space="preserve">    product_name      NVARCHAR(200)     NOT NULL,</w:t>
+      </w:r>
+    </w:p>
+    <w:p>
+      <w:r>
+        <w:t xml:space="preserve">    brand_id          INT               NULL,</w:t>
+      </w:r>
+    </w:p>
+    <w:p>
+      <w:r>
+        <w:t xml:space="preserve">    brand_name        NVARCHAR(100)     NULL,</w:t>
+      </w:r>
+    </w:p>
+    <w:p>
+      <w:r>
+        <w:t xml:space="preserve">    department_id     INT               NULL,</w:t>
+      </w:r>
+    </w:p>
+    <w:p>
+      <w:r>
+        <w:t xml:space="preserve">    department_name   NVARCHAR(100)     NULL,</w:t>
+      </w:r>
+    </w:p>
+    <w:p>
+      <w:r>
+        <w:t xml:space="preserve">    package_size      NVARCHAR(100)     NULL,</w:t>
+      </w:r>
+    </w:p>
+    <w:p>
+      <w:r>
+        <w:t xml:space="preserve">    CONSTRAINT pk_dim_product PRIMARY KEY (product_key),</w:t>
+      </w:r>
+    </w:p>
+    <w:p>
+      <w:r>
+        <w:t xml:space="preserve">    CONSTRAINT uq_dim_product_product_id UNIQUE (product_id)</w:t>
+      </w:r>
+    </w:p>
+    <w:p>
+      <w:r>
+        <w:t xml:space="preserve">);</w:t>
+      </w:r>
+    </w:p>
+    <w:p>
+      <w:r>
+        <w:t xml:space="preserve"/>
+      </w:r>
+    </w:p>
+    <w:p>
+      <w:r>
+        <w:t xml:space="preserve">CREATE TABLE gold.dim_promotion (</w:t>
+      </w:r>
+    </w:p>
+    <w:p>
+      <w:r>
+        <w:t xml:space="preserve">    promotion_key         INT IDENTITY(1,1) NOT NULL,</w:t>
+      </w:r>
+    </w:p>
+    <w:p>
+      <w:r>
+        <w:t xml:space="preserve">    promotion_id          INT               NOT NULL,</w:t>
+      </w:r>
+    </w:p>
+    <w:p>
+      <w:r>
+        <w:t xml:space="preserve">    promo_type            NVARCHAR(100)     NOT NULL,</w:t>
+      </w:r>
+    </w:p>
+    <w:p>
+      <w:r>
+        <w:t xml:space="preserve">    discount_percent      DECIMAL(5,2)      NOT NULL,</w:t>
+      </w:r>
+    </w:p>
+    <w:p>
+      <w:r>
+        <w:t xml:space="preserve">    start_date            DATE              NULL,</w:t>
+      </w:r>
+    </w:p>
+    <w:p>
+      <w:r>
+        <w:t xml:space="preserve">    end_date              DATE              NULL,</w:t>
+      </w:r>
+    </w:p>
+    <w:p>
+      <w:r>
+        <w:t xml:space="preserve">    promo_duration_days   INT               NULL,</w:t>
+      </w:r>
+    </w:p>
+    <w:p>
+      <w:r>
+        <w:t xml:space="preserve">    CONSTRAINT pk_dim_promotion PRIMARY KEY (promotion_key),</w:t>
+      </w:r>
+    </w:p>
+    <w:p>
+      <w:r>
+        <w:t xml:space="preserve">    CONSTRAINT uq_dim_promotion_promotion_id UNIQUE (promotion_id)</w:t>
+      </w:r>
+    </w:p>
+    <w:p>
+      <w:r>
+        <w:t xml:space="preserve">);</w:t>
+      </w:r>
+    </w:p>
+    <w:p>
+      <w:r>
+        <w:t xml:space="preserve"/>
+      </w:r>
+    </w:p>
+    <w:p>
+      <w:r>
+        <w:t xml:space="preserve">-- ============================================================</w:t>
+      </w:r>
+    </w:p>
+    <w:p>
+      <w:r>
+        <w:t xml:space="preserve">-- STAR-SPECIFIC DIMENSIONS</w:t>
+      </w:r>
+    </w:p>
+    <w:p>
+      <w:r>
+        <w:t xml:space="preserve">-- ============================================================</w:t>
+      </w:r>
+    </w:p>
+    <w:p>
+      <w:r>
+        <w:t xml:space="preserve">CREATE TABLE gold.dim_store (</w:t>
+      </w:r>
+    </w:p>
+    <w:p>
+      <w:r>
+        <w:t xml:space="preserve">    store_key       INT IDENTITY(1,1) NOT NULL,</w:t>
+      </w:r>
+    </w:p>
+    <w:p>
+      <w:r>
+        <w:t xml:space="preserve">    store_id        INT               NOT NULL,</w:t>
+      </w:r>
+    </w:p>
+    <w:p>
+      <w:r>
+        <w:t xml:space="preserve">    store_name      NVARCHAR(150)     NOT NULL,</w:t>
+      </w:r>
+    </w:p>
+    <w:p>
+      <w:r>
+        <w:t xml:space="preserve">    city            NVARCHAR(100)     NULL,</w:t>
+      </w:r>
+    </w:p>
+    <w:p>
+      <w:r>
+        <w:t xml:space="preserve">    state           NVARCHAR(50)      NULL,</w:t>
+      </w:r>
+    </w:p>
+    <w:p>
+      <w:r>
+        <w:t xml:space="preserve">    region          NVARCHAR(100)     NULL,</w:t>
+      </w:r>
+    </w:p>
+    <w:p>
+      <w:r>
+        <w:t xml:space="preserve">    opening_date    DATE              NULL,</w:t>
+      </w:r>
+    </w:p>
+    <w:p>
+      <w:r>
+        <w:t xml:space="preserve">    CONSTRAINT pk_dim_store PRIMARY KEY (store_key),</w:t>
+      </w:r>
+    </w:p>
+    <w:p>
+      <w:r>
+        <w:t xml:space="preserve">    CONSTRAINT uq_dim_store_store_id UNIQUE (store_id)</w:t>
+      </w:r>
+    </w:p>
+    <w:p>
+      <w:r>
+        <w:t xml:space="preserve">);</w:t>
+      </w:r>
+    </w:p>
+    <w:p>
+      <w:r>
+        <w:t xml:space="preserve"/>
+      </w:r>
+    </w:p>
+    <w:p>
+      <w:r>
+        <w:t xml:space="preserve">CREATE TABLE gold.dim_employee (</w:t>
+      </w:r>
+    </w:p>
+    <w:p>
+      <w:r>
+        <w:t xml:space="preserve">    employee_key    INT IDENTITY(1,1) NOT NULL,</w:t>
+      </w:r>
+    </w:p>
+    <w:p>
+      <w:r>
+        <w:t xml:space="preserve">    employee_id     INT               NOT NULL,</w:t>
+      </w:r>
+    </w:p>
+    <w:p>
+      <w:r>
+        <w:t xml:space="preserve">    employee_name   NVARCHAR(150)     NOT NULL,</w:t>
+      </w:r>
+    </w:p>
+    <w:p>
+      <w:r>
+        <w:t xml:space="preserve">    gender          NVARCHAR(10)      NOT NULL,</w:t>
+      </w:r>
+    </w:p>
+    <w:p>
+      <w:r>
+        <w:t xml:space="preserve">    position        NVARCHAR(100)     NULL,</w:t>
+      </w:r>
+    </w:p>
+    <w:p>
+      <w:r>
+        <w:t xml:space="preserve">    store_id        INT               NULL,</w:t>
+      </w:r>
+    </w:p>
+    <w:p>
+      <w:r>
+        <w:t xml:space="preserve">    hire_date       DATE              NULL,</w:t>
+      </w:r>
+    </w:p>
+    <w:p>
+      <w:r>
+        <w:t xml:space="preserve">    tenure_years    INT               NULL,</w:t>
+      </w:r>
+    </w:p>
+    <w:p>
+      <w:r>
+        <w:t xml:space="preserve">    CONSTRAINT pk_dim_employee PRIMARY KEY (employee_key),</w:t>
+      </w:r>
+    </w:p>
+    <w:p>
+      <w:r>
+        <w:t xml:space="preserve">    CONSTRAINT uq_dim_employee_employee_id UNIQUE (employee_id)</w:t>
+      </w:r>
+    </w:p>
+    <w:p>
+      <w:r>
+        <w:t xml:space="preserve">);</w:t>
+      </w:r>
+    </w:p>
+    <w:p>
+      <w:r>
+        <w:t xml:space="preserve"/>
+      </w:r>
+    </w:p>
+    <w:p>
+      <w:r>
+        <w:t xml:space="preserve">CREATE TABLE gold.dim_warehouse (</w:t>
+      </w:r>
+    </w:p>
+    <w:p>
+      <w:r>
+        <w:t xml:space="preserve">    warehouse_key     INT IDENTITY(1,1) NOT NULL,</w:t>
+      </w:r>
+    </w:p>
+    <w:p>
+      <w:r>
+        <w:t xml:space="preserve">    warehouse_id      INT               NOT NULL,</w:t>
+      </w:r>
+    </w:p>
+    <w:p>
+      <w:r>
+        <w:t xml:space="preserve">    warehouse_name    NVARCHAR(150)     NOT NULL,</w:t>
+      </w:r>
+    </w:p>
+    <w:p>
+      <w:r>
+        <w:t xml:space="preserve">    city              NVARCHAR(100)     NULL,</w:t>
+      </w:r>
+    </w:p>
+    <w:p>
+      <w:r>
+        <w:t xml:space="preserve">    state             NVARCHAR(50)      NULL,</w:t>
+      </w:r>
+    </w:p>
+    <w:p>
+      <w:r>
+        <w:t xml:space="preserve">    CONSTRAINT pk_dim_warehouse PRIMARY KEY (warehouse_key),</w:t>
+      </w:r>
+    </w:p>
+    <w:p>
+      <w:r>
+        <w:t xml:space="preserve">    CONSTRAINT uq_dim_warehouse_warehouse_id UNIQUE (warehouse_id)</w:t>
+      </w:r>
+    </w:p>
+    <w:p>
+      <w:r>
+        <w:t xml:space="preserve">);</w:t>
+      </w:r>
+    </w:p>
+    <w:p>
+      <w:r>
+        <w:t xml:space="preserve"/>
+      </w:r>
+    </w:p>
+    <w:p>
+      <w:r>
+        <w:t xml:space="preserve">CREATE TABLE gold.dim_order_status (</w:t>
+      </w:r>
+    </w:p>
+    <w:p>
+      <w:r>
+        <w:t xml:space="preserve">    order_status_key    INT IDENTITY(1,1) NOT NULL,</w:t>
+      </w:r>
+    </w:p>
+    <w:p>
+      <w:r>
+        <w:t xml:space="preserve">    status_name         NVARCHAR(50)      NOT NULL,</w:t>
+      </w:r>
+    </w:p>
+    <w:p>
+      <w:r>
+        <w:t xml:space="preserve">    status_description  NVARCHAR(200)     NOT NULL,</w:t>
+      </w:r>
+    </w:p>
+    <w:p>
+      <w:r>
+        <w:t xml:space="preserve">    CONSTRAINT pk_dim_order_status PRIMARY KEY (order_status_key),</w:t>
+      </w:r>
+    </w:p>
+    <w:p>
+      <w:r>
+        <w:t xml:space="preserve">    CONSTRAINT uq_dim_order_status_status_name UNIQUE (status_name)</w:t>
+      </w:r>
+    </w:p>
+    <w:p>
+      <w:r>
+        <w:t xml:space="preserve">);</w:t>
+      </w:r>
+    </w:p>
+    <w:p>
+      <w:r>
+        <w:t xml:space="preserve"/>
+      </w:r>
+    </w:p>
+    <w:p>
+      <w:r>
+        <w:t xml:space="preserve">CREATE TABLE gold.dim_payment_method (</w:t>
+      </w:r>
+    </w:p>
+    <w:p>
+      <w:r>
+        <w:t xml:space="preserve">    payment_method_key   INT IDENTITY(1,1) NOT NULL,</w:t>
+      </w:r>
+    </w:p>
+    <w:p>
+      <w:r>
+        <w:t xml:space="preserve">    payment_method_name  NVARCHAR(100)     NOT NULL,</w:t>
+      </w:r>
+    </w:p>
+    <w:p>
+      <w:r>
+        <w:t xml:space="preserve">    payment_provider     NVARCHAR(100)     NOT NULL,</w:t>
+      </w:r>
+    </w:p>
+    <w:p>
+      <w:r>
+        <w:t xml:space="preserve">    CONSTRAINT pk_dim_payment_method PRIMARY KEY (payment_method_key),</w:t>
+      </w:r>
+    </w:p>
+    <w:p>
+      <w:r>
+        <w:t xml:space="preserve">    CONSTRAINT uq_dim_payment_method_name UNIQUE (payment_method_name)</w:t>
+      </w:r>
+    </w:p>
+    <w:p>
+      <w:r>
+        <w:t xml:space="preserve">);</w:t>
+      </w:r>
+    </w:p>
+    <w:p>
+      <w:r>
+        <w:t xml:space="preserve"/>
+      </w:r>
+    </w:p>
+    <w:p>
+      <w:r>
+        <w:t xml:space="preserve">-- ============================================================</w:t>
+      </w:r>
+    </w:p>
+    <w:p>
+      <w:r>
+        <w:t xml:space="preserve">-- FACT TABLES</w:t>
+      </w:r>
+    </w:p>
+    <w:p>
+      <w:r>
+        <w:t xml:space="preserve">-- ============================================================</w:t>
+      </w:r>
+    </w:p>
+    <w:p>
+      <w:r>
+        <w:t xml:space="preserve">CREATE TABLE gold.fact_store_sales (</w:t>
+      </w:r>
+    </w:p>
+    <w:p>
+      <w:r>
+        <w:t xml:space="preserve">    fact_store_sales_sk    BIGINT IDENTITY(1,1) NOT NULL,</w:t>
+      </w:r>
+    </w:p>
+    <w:p>
+      <w:r>
+        <w:t xml:space="preserve">    date_key               INT                  NOT NULL,</w:t>
+      </w:r>
+    </w:p>
+    <w:p>
+      <w:r>
+        <w:t xml:space="preserve">    store_key              INT                  NOT NULL,</w:t>
+      </w:r>
+    </w:p>
+    <w:p>
+      <w:r>
+        <w:t xml:space="preserve">    product_key            INT                  NOT NULL,</w:t>
+      </w:r>
+    </w:p>
+    <w:p>
+      <w:r>
+        <w:t xml:space="preserve">    customer_key           INT                  NOT NULL,</w:t>
+      </w:r>
+    </w:p>
+    <w:p>
+      <w:r>
+        <w:t xml:space="preserve">    employee_key           INT                  NOT NULL,</w:t>
+      </w:r>
+    </w:p>
+    <w:p>
+      <w:r>
+        <w:t xml:space="preserve">    promotion_key          INT                  NOT NULL,</w:t>
+      </w:r>
+    </w:p>
+    <w:p>
+      <w:r>
+        <w:t xml:space="preserve">    source_line_number     INT                  NOT NULL,</w:t>
+      </w:r>
+    </w:p>
+    <w:p>
+      <w:r>
+        <w:t xml:space="preserve">    transaction_number     NVARCHAR(50)         NOT NULL,</w:t>
+      </w:r>
+    </w:p>
+    <w:p>
+      <w:r>
+        <w:t xml:space="preserve">    transaction_time       DATETIME             NULL,</w:t>
+      </w:r>
+    </w:p>
+    <w:p>
+      <w:r>
+        <w:t xml:space="preserve">    quantity               INT                  NOT NULL,</w:t>
+      </w:r>
+    </w:p>
+    <w:p>
+      <w:r>
+        <w:t xml:space="preserve">    unit_price             DECIMAL(10,2)        NOT NULL,</w:t>
+      </w:r>
+    </w:p>
+    <w:p>
+      <w:r>
+        <w:t xml:space="preserve">    gross_sales_amount     DECIMAL(12,2)        NOT NULL,</w:t>
+      </w:r>
+    </w:p>
+    <w:p>
+      <w:r>
+        <w:t xml:space="preserve">    discount_percent       DECIMAL(5,2)         NOT NULL,</w:t>
+      </w:r>
+    </w:p>
+    <w:p>
+      <w:r>
+        <w:t xml:space="preserve">    discount_amount        DECIMAL(12,2)        NOT NULL,</w:t>
+      </w:r>
+    </w:p>
+    <w:p>
+      <w:r>
+        <w:t xml:space="preserve">    net_sales_amount       DECIMAL(12,2)        NOT NULL,</w:t>
+      </w:r>
+    </w:p>
+    <w:p>
+      <w:r>
+        <w:t xml:space="preserve">    load_datetime          DATETIME             NOT NULL CONSTRAINT df_fact_store_sales_load_datetime DEFAULT GETDATE(),</w:t>
+      </w:r>
+    </w:p>
+    <w:p>
+      <w:r>
+        <w:t xml:space="preserve">    CONSTRAINT pk_fact_store_sales PRIMARY KEY (fact_store_sales_sk),</w:t>
+      </w:r>
+    </w:p>
+    <w:p>
+      <w:r>
+        <w:t xml:space="preserve">    CONSTRAINT fk_fact_store_sales_date      FOREIGN KEY (date_key)      REFERENCES gold.dim_date(date_key),</w:t>
+      </w:r>
+    </w:p>
+    <w:p>
+      <w:r>
+        <w:t xml:space="preserve">    CONSTRAINT fk_fact_store_sales_store     FOREIGN KEY (store_key)     REFERENCES gold.dim_store(store_key),</w:t>
+      </w:r>
+    </w:p>
+    <w:p>
+      <w:r>
+        <w:t xml:space="preserve">    CONSTRAINT fk_fact_store_sales_product   FOREIGN KEY (product_key)   REFERENCES gold.dim_product(product_key),</w:t>
+      </w:r>
+    </w:p>
+    <w:p>
+      <w:r>
+        <w:t xml:space="preserve">    CONSTRAINT fk_fact_store_sales_customer  FOREIGN KEY (customer_key)  REFERENCES gold.dim_customer(customer_key),</w:t>
+      </w:r>
+    </w:p>
+    <w:p>
+      <w:r>
+        <w:t xml:space="preserve">    CONSTRAINT fk_fact_store_sales_employee  FOREIGN KEY (employee_key)  REFERENCES gold.dim_employee(employee_key),</w:t>
+      </w:r>
+    </w:p>
+    <w:p>
+      <w:r>
+        <w:t xml:space="preserve">    CONSTRAINT fk_fact_store_sales_promotion FOREIGN KEY (promotion_key) REFERENCES gold.dim_promotion(promotion_key)</w:t>
+      </w:r>
+    </w:p>
+    <w:p>
+      <w:r>
+        <w:t xml:space="preserve">);</w:t>
+      </w:r>
+    </w:p>
+    <w:p>
+      <w:r>
+        <w:t xml:space="preserve"/>
+      </w:r>
+    </w:p>
+    <w:p>
+      <w:r>
+        <w:t xml:space="preserve">CREATE TABLE gold.fact_online_sales (</w:t>
+      </w:r>
+    </w:p>
+    <w:p>
+      <w:r>
+        <w:t xml:space="preserve">    fact_online_sales_sk    BIGINT IDENTITY(1,1) NOT NULL,</w:t>
+      </w:r>
+    </w:p>
+    <w:p>
+      <w:r>
+        <w:t xml:space="preserve">    date_key                INT                  NOT NULL,</w:t>
+      </w:r>
+    </w:p>
+    <w:p>
+      <w:r>
+        <w:t xml:space="preserve">    customer_key            INT                  NOT NULL,</w:t>
+      </w:r>
+    </w:p>
+    <w:p>
+      <w:r>
+        <w:t xml:space="preserve">    product_key             INT                  NOT NULL,</w:t>
+      </w:r>
+    </w:p>
+    <w:p>
+      <w:r>
+        <w:t xml:space="preserve">    warehouse_key           INT                  NOT NULL,</w:t>
+      </w:r>
+    </w:p>
+    <w:p>
+      <w:r>
+        <w:t xml:space="preserve">    promotion_key           INT                  NOT NULL,</w:t>
+      </w:r>
+    </w:p>
+    <w:p>
+      <w:r>
+        <w:t xml:space="preserve">    order_status_key        INT                  NOT NULL,</w:t>
+      </w:r>
+    </w:p>
+    <w:p>
+      <w:r>
+        <w:t xml:space="preserve">    payment_method_key      INT                  NOT NULL,</w:t>
+      </w:r>
+    </w:p>
+    <w:p>
+      <w:r>
+        <w:t xml:space="preserve">    source_order_item_number INT                 NOT NULL,</w:t>
+      </w:r>
+    </w:p>
+    <w:p>
+      <w:r>
+        <w:t xml:space="preserve">    source_order_number     INT                  NOT NULL,</w:t>
+      </w:r>
+    </w:p>
+    <w:p>
+      <w:r>
+        <w:t xml:space="preserve">    quantity                INT                  NOT NULL,</w:t>
+      </w:r>
+    </w:p>
+    <w:p>
+      <w:r>
+        <w:t xml:space="preserve">    unit_price              DECIMAL(10,2)        NOT NULL,</w:t>
+      </w:r>
+    </w:p>
+    <w:p>
+      <w:r>
+        <w:t xml:space="preserve">    gross_sales_amount      DECIMAL(12,2)        NOT NULL,</w:t>
+      </w:r>
+    </w:p>
+    <w:p>
+      <w:r>
+        <w:t xml:space="preserve">    discount_percent        DECIMAL(5,2)         NOT NULL,</w:t>
+      </w:r>
+    </w:p>
+    <w:p>
+      <w:r>
+        <w:t xml:space="preserve">    discount_amount         DECIMAL(12,2)        NOT NULL,</w:t>
+      </w:r>
+    </w:p>
+    <w:p>
+      <w:r>
+        <w:t xml:space="preserve">    net_sales_amount        DECIMAL(12,2)        NOT NULL,</w:t>
+      </w:r>
+    </w:p>
+    <w:p>
+      <w:r>
+        <w:t xml:space="preserve">    order_total             DECIMAL(10,2)        NULL,</w:t>
+      </w:r>
+    </w:p>
+    <w:p>
+      <w:r>
+        <w:t xml:space="preserve">    load_datetime           DATETIME             NOT NULL CONSTRAINT df_fact_online_sales_load_datetime DEFAULT GETDATE(),</w:t>
+      </w:r>
+    </w:p>
+    <w:p>
+      <w:r>
+        <w:t xml:space="preserve">    CONSTRAINT pk_fact_online_sales PRIMARY KEY (fact_online_sales_sk),</w:t>
+      </w:r>
+    </w:p>
+    <w:p>
+      <w:r>
+        <w:t xml:space="preserve">    CONSTRAINT fk_fact_online_sales_date      FOREIGN KEY (date_key)      REFERENCES gold.dim_date(date_key),</w:t>
+      </w:r>
+    </w:p>
+    <w:p>
+      <w:r>
+        <w:t xml:space="preserve">    CONSTRAINT fk_fact_online_sales_customer  FOREIGN KEY (customer_key)  REFERENCES gold.dim_customer(customer_key),</w:t>
+      </w:r>
+    </w:p>
+    <w:p>
+      <w:r>
+        <w:t xml:space="preserve">    CONSTRAINT fk_fact_online_sales_product   FOREIGN KEY (product_key)   REFERENCES gold.dim_product(product_key),</w:t>
+      </w:r>
+    </w:p>
+    <w:p>
+      <w:r>
+        <w:t xml:space="preserve">    CONSTRAINT fk_fact_online_sales_warehouse FOREIGN KEY (warehouse_key) REFERENCES gold.dim_warehouse(warehouse_key),</w:t>
+      </w:r>
+    </w:p>
+    <w:p>
+      <w:r>
+        <w:t xml:space="preserve">    CONSTRAINT fk_fact_online_sales_promotion FOREIGN KEY (promotion_key) REFERENCES gold.dim_promotion(promotion_key),</w:t>
+      </w:r>
+    </w:p>
+    <w:p>
+      <w:r>
+        <w:t xml:space="preserve">    CONSTRAINT fk_fact_online_sales_order_status FOREIGN KEY (order_status_key) REFERENCES gold.dim_order_status(order_status_key),</w:t>
+      </w:r>
+    </w:p>
+    <w:p>
+      <w:r>
+        <w:t xml:space="preserve">    CONSTRAINT fk_fact_online_sales_payment_method FOREIGN KEY (payment_method_key) REFERENCES gold.dim_payment_method(payment_method_key)</w:t>
+      </w:r>
+    </w:p>
+    <w:p>
+      <w:r>
+        <w:t xml:space="preserve">);</w:t>
+      </w:r>
+    </w:p>
+    <w:p>
+      <w:r>
+        <w:t xml:space="preserve">GO</w:t>
+      </w:r>
+    </w:p>
+    <w:p>
+      <w:r>
+        <w:t xml:space="preserve"/>
+      </w:r>
+    </w:p>
+    <w:p>
+      <w:r>
+        <w:t xml:space="preserve">PRINT 'All Gold tables created successfully.';</w:t>
+      </w:r>
+    </w:p>
+    <w:p>
+      <w:pPr>
+        <w:pStyle w:val="Heading2"/>
+      </w:pPr>
+      <w:r>
+        <w:t xml:space="preserve">Appendix B: Scripts/Gold/proc_load_gold.sql</w:t>
+      </w:r>
+    </w:p>
+    <w:p>
+      <w:r>
+        <w:t xml:space="preserve">/*</w:t>
+      </w:r>
+    </w:p>
+    <w:p>
+      <w:r>
+        <w:t xml:space="preserve">===============================================================================</w:t>
+      </w:r>
+    </w:p>
+    <w:p>
+      <w:r>
+        <w:t xml:space="preserve">Stored Procedure: proc_load_gold.sql</w:t>
+      </w:r>
+    </w:p>
+    <w:p>
+      <w:r>
+        <w:t xml:space="preserve">Purpose:  Loads the Gold Layer Galaxy Schema from Silver tables.</w:t>
+      </w:r>
+    </w:p>
+    <w:p>
+      <w:r>
+        <w:t xml:space="preserve"/>
+      </w:r>
+    </w:p>
+    <w:p>
+      <w:r>
+        <w:t xml:space="preserve">Business processes:</w:t>
+      </w:r>
+    </w:p>
+    <w:p>
+      <w:r>
+        <w:t xml:space="preserve">  1. Store Sales Performance  - one row per POS transaction line item</w:t>
+      </w:r>
+    </w:p>
+    <w:p>
+      <w:r>
+        <w:t xml:space="preserve">  2. Online Sales Performance - one row per online order line item</w:t>
+      </w:r>
+    </w:p>
+    <w:p>
+      <w:r>
+        <w:t xml:space="preserve"/>
+      </w:r>
+    </w:p>
+    <w:p>
+      <w:r>
+        <w:t xml:space="preserve">Conformed dimensions:</w:t>
+      </w:r>
+    </w:p>
+    <w:p>
+      <w:r>
+        <w:t xml:space="preserve">  gold.dim_date, gold.dim_customer, gold.dim_product, gold.dim_promotion</w:t>
+      </w:r>
+    </w:p>
+    <w:p>
+      <w:r>
+        <w:t xml:space="preserve">===============================================================================</w:t>
+      </w:r>
+    </w:p>
+    <w:p>
+      <w:r>
+        <w:t xml:space="preserve">*/</w:t>
+      </w:r>
+    </w:p>
+    <w:p>
+      <w:r>
+        <w:t xml:space="preserve"/>
+      </w:r>
+    </w:p>
+    <w:p>
+      <w:r>
+        <w:t xml:space="preserve">USE DataWarehouse;</w:t>
+      </w:r>
+    </w:p>
+    <w:p>
+      <w:r>
+        <w:t xml:space="preserve">GO</w:t>
+      </w:r>
+    </w:p>
+    <w:p>
+      <w:r>
+        <w:t xml:space="preserve"/>
+      </w:r>
+    </w:p>
+    <w:p>
+      <w:r>
+        <w:t xml:space="preserve">CREATE OR ALTER PROCEDURE gold.load_gold</w:t>
+      </w:r>
+    </w:p>
+    <w:p>
+      <w:r>
+        <w:t xml:space="preserve">AS</w:t>
+      </w:r>
+    </w:p>
+    <w:p>
+      <w:r>
+        <w:t xml:space="preserve">BEGIN</w:t>
+      </w:r>
+    </w:p>
+    <w:p>
+      <w:r>
+        <w:t xml:space="preserve">    SET NOCOUNT ON;</w:t>
+      </w:r>
+    </w:p>
+    <w:p>
+      <w:r>
+        <w:t xml:space="preserve">    SET XACT_ABORT ON;</w:t>
+      </w:r>
+    </w:p>
+    <w:p>
+      <w:r>
+        <w:t xml:space="preserve"/>
+      </w:r>
+    </w:p>
+    <w:p>
+      <w:r>
+        <w:t xml:space="preserve">    DECLARE @start_time DATETIME = GETDATE();</w:t>
+      </w:r>
+    </w:p>
+    <w:p>
+      <w:r>
+        <w:t xml:space="preserve"/>
+      </w:r>
+    </w:p>
+    <w:p>
+      <w:r>
+        <w:t xml:space="preserve">    PRINT '======================================================';</w:t>
+      </w:r>
+    </w:p>
+    <w:p>
+      <w:r>
+        <w:t xml:space="preserve">    PRINT 'Starting Gold Layer Load';</w:t>
+      </w:r>
+    </w:p>
+    <w:p>
+      <w:r>
+        <w:t xml:space="preserve">    PRINT 'Procedure : gold.load_gold';</w:t>
+      </w:r>
+    </w:p>
+    <w:p>
+      <w:r>
+        <w:t xml:space="preserve">    PRINT 'Start Time: ' + CAST(@start_time AS NVARCHAR(50));</w:t>
+      </w:r>
+    </w:p>
+    <w:p>
+      <w:r>
+        <w:t xml:space="preserve">    PRINT '======================================================';</w:t>
+      </w:r>
+    </w:p>
+    <w:p>
+      <w:r>
+        <w:t xml:space="preserve"/>
+      </w:r>
+    </w:p>
+    <w:p>
+      <w:r>
+        <w:t xml:space="preserve">    BEGIN TRY</w:t>
+      </w:r>
+    </w:p>
+    <w:p>
+      <w:r>
+        <w:t xml:space="preserve">        BEGIN TRANSACTION;</w:t>
+      </w:r>
+    </w:p>
+    <w:p>
+      <w:r>
+        <w:t xml:space="preserve"/>
+      </w:r>
+    </w:p>
+    <w:p>
+      <w:r>
+        <w:t xml:space="preserve">        -- Facts first because they reference dimensions.</w:t>
+      </w:r>
+    </w:p>
+    <w:p>
+      <w:r>
+        <w:t xml:space="preserve">        DELETE FROM gold.fact_online_sales;</w:t>
+      </w:r>
+    </w:p>
+    <w:p>
+      <w:r>
+        <w:t xml:space="preserve">        DELETE FROM gold.fact_store_sales;</w:t>
+      </w:r>
+    </w:p>
+    <w:p>
+      <w:r>
+        <w:t xml:space="preserve"/>
+      </w:r>
+    </w:p>
+    <w:p>
+      <w:r>
+        <w:t xml:space="preserve">        DELETE FROM gold.dim_payment_method;</w:t>
+      </w:r>
+    </w:p>
+    <w:p>
+      <w:r>
+        <w:t xml:space="preserve">        DELETE FROM gold.dim_order_status;</w:t>
+      </w:r>
+    </w:p>
+    <w:p>
+      <w:r>
+        <w:t xml:space="preserve">        DELETE FROM gold.dim_warehouse;</w:t>
+      </w:r>
+    </w:p>
+    <w:p>
+      <w:r>
+        <w:t xml:space="preserve">        DELETE FROM gold.dim_employee;</w:t>
+      </w:r>
+    </w:p>
+    <w:p>
+      <w:r>
+        <w:t xml:space="preserve">        DELETE FROM gold.dim_store;</w:t>
+      </w:r>
+    </w:p>
+    <w:p>
+      <w:r>
+        <w:t xml:space="preserve">        DELETE FROM gold.dim_promotion;</w:t>
+      </w:r>
+    </w:p>
+    <w:p>
+      <w:r>
+        <w:t xml:space="preserve">        DELETE FROM gold.dim_product;</w:t>
+      </w:r>
+    </w:p>
+    <w:p>
+      <w:r>
+        <w:t xml:space="preserve">        DELETE FROM gold.dim_customer;</w:t>
+      </w:r>
+    </w:p>
+    <w:p>
+      <w:r>
+        <w:t xml:space="preserve">        DELETE FROM gold.dim_date;</w:t>
+      </w:r>
+    </w:p>
+    <w:p>
+      <w:r>
+        <w:t xml:space="preserve"/>
+      </w:r>
+    </w:p>
+    <w:p>
+      <w:r>
+        <w:t xml:space="preserve">        -- ============================================================</w:t>
+      </w:r>
+    </w:p>
+    <w:p>
+      <w:r>
+        <w:t xml:space="preserve">        -- DATE DIMENSION</w:t>
+      </w:r>
+    </w:p>
+    <w:p>
+      <w:r>
+        <w:t xml:space="preserve">        -- Includes one unknown date member plus all analytical dates</w:t>
+      </w:r>
+    </w:p>
+    <w:p>
+      <w:r>
+        <w:t xml:space="preserve">        -- needed by the two facts and supporting dimensions.</w:t>
+      </w:r>
+    </w:p>
+    <w:p>
+      <w:r>
+        <w:t xml:space="preserve">        -- ============================================================</w:t>
+      </w:r>
+    </w:p>
+    <w:p>
+      <w:r>
+        <w:t xml:space="preserve">        WITH source_dates AS (</w:t>
+      </w:r>
+    </w:p>
+    <w:p>
+      <w:r>
+        <w:t xml:space="preserve">            SELECT CAST('19000101' AS DATE) AS full_date</w:t>
+      </w:r>
+    </w:p>
+    <w:p>
+      <w:r>
+        <w:t xml:space="preserve">            UNION</w:t>
+      </w:r>
+    </w:p>
+    <w:p>
+      <w:r>
+        <w:t xml:space="preserve">            SELECT Transaction_Date FROM silver.pos_transactions WHERE Transaction_Date IS NOT NULL</w:t>
+      </w:r>
+    </w:p>
+    <w:p>
+      <w:r>
+        <w:t xml:space="preserve">            UNION</w:t>
+      </w:r>
+    </w:p>
+    <w:p>
+      <w:r>
+        <w:t xml:space="preserve">            SELECT Order_Date FROM silver.online_orders WHERE Order_Date IS NOT NULL</w:t>
+      </w:r>
+    </w:p>
+    <w:p>
+      <w:r>
+        <w:t xml:space="preserve">            UNION</w:t>
+      </w:r>
+    </w:p>
+    <w:p>
+      <w:r>
+        <w:t xml:space="preserve">            SELECT Start_Date FROM silver.promotions WHERE Start_Date IS NOT NULL</w:t>
+      </w:r>
+    </w:p>
+    <w:p>
+      <w:r>
+        <w:t xml:space="preserve">            UNION</w:t>
+      </w:r>
+    </w:p>
+    <w:p>
+      <w:r>
+        <w:t xml:space="preserve">            SELECT End_Date FROM silver.promotions WHERE End_Date IS NOT NULL</w:t>
+      </w:r>
+    </w:p>
+    <w:p>
+      <w:r>
+        <w:t xml:space="preserve">            UNION</w:t>
+      </w:r>
+    </w:p>
+    <w:p>
+      <w:r>
+        <w:t xml:space="preserve">            SELECT Opening_Date FROM silver.stores WHERE Opening_Date IS NOT NULL</w:t>
+      </w:r>
+    </w:p>
+    <w:p>
+      <w:r>
+        <w:t xml:space="preserve">            UNION</w:t>
+      </w:r>
+    </w:p>
+    <w:p>
+      <w:r>
+        <w:t xml:space="preserve">            SELECT Hire_Date FROM silver.employees WHERE Hire_Date IS NOT NULL</w:t>
+      </w:r>
+    </w:p>
+    <w:p>
+      <w:r>
+        <w:t xml:space="preserve">        )</w:t>
+      </w:r>
+    </w:p>
+    <w:p>
+      <w:r>
+        <w:t xml:space="preserve">        INSERT INTO gold.dim_date (</w:t>
+      </w:r>
+    </w:p>
+    <w:p>
+      <w:r>
+        <w:t xml:space="preserve">            full_date, day_number, month_number, month_name, quarter_number,</w:t>
+      </w:r>
+    </w:p>
+    <w:p>
+      <w:r>
+        <w:t xml:space="preserve">            year_number, day_of_week_number, day_name, is_weekend</w:t>
+      </w:r>
+    </w:p>
+    <w:p>
+      <w:r>
+        <w:t xml:space="preserve">        )</w:t>
+      </w:r>
+    </w:p>
+    <w:p>
+      <w:r>
+        <w:t xml:space="preserve">        SELECT</w:t>
+      </w:r>
+    </w:p>
+    <w:p>
+      <w:r>
+        <w:t xml:space="preserve">            full_date,</w:t>
+      </w:r>
+    </w:p>
+    <w:p>
+      <w:r>
+        <w:t xml:space="preserve">            DAY(full_date),</w:t>
+      </w:r>
+    </w:p>
+    <w:p>
+      <w:r>
+        <w:t xml:space="preserve">            MONTH(full_date),</w:t>
+      </w:r>
+    </w:p>
+    <w:p>
+      <w:r>
+        <w:t xml:space="preserve">            DATENAME(MONTH, full_date),</w:t>
+      </w:r>
+    </w:p>
+    <w:p>
+      <w:r>
+        <w:t xml:space="preserve">            DATEPART(QUARTER, full_date),</w:t>
+      </w:r>
+    </w:p>
+    <w:p>
+      <w:r>
+        <w:t xml:space="preserve">            YEAR(full_date),</w:t>
+      </w:r>
+    </w:p>
+    <w:p>
+      <w:r>
+        <w:t xml:space="preserve">            DATEPART(WEEKDAY, full_date),</w:t>
+      </w:r>
+    </w:p>
+    <w:p>
+      <w:r>
+        <w:t xml:space="preserve">            DATENAME(WEEKDAY, full_date),</w:t>
+      </w:r>
+    </w:p>
+    <w:p>
+      <w:r>
+        <w:t xml:space="preserve">            CASE WHEN DATENAME(WEEKDAY, full_date) IN ('Saturday', 'Sunday') THEN 1 ELSE 0 END</w:t>
+      </w:r>
+    </w:p>
+    <w:p>
+      <w:r>
+        <w:t xml:space="preserve">        FROM source_dates;</w:t>
+      </w:r>
+    </w:p>
+    <w:p>
+      <w:r>
+        <w:t xml:space="preserve"/>
+      </w:r>
+    </w:p>
+    <w:p>
+      <w:r>
+        <w:t xml:space="preserve">        PRINT 'Loaded gold.dim_date rows: ' + CAST(@@ROWCOUNT AS NVARCHAR(20));</w:t>
+      </w:r>
+    </w:p>
+    <w:p>
+      <w:r>
+        <w:t xml:space="preserve"/>
+      </w:r>
+    </w:p>
+    <w:p>
+      <w:r>
+        <w:t xml:space="preserve">        -- ============================================================</w:t>
+      </w:r>
+    </w:p>
+    <w:p>
+      <w:r>
+        <w:t xml:space="preserve">        -- CONFORMED CUSTOMER DIMENSION</w:t>
+      </w:r>
+    </w:p>
+    <w:p>
+      <w:r>
+        <w:t xml:space="preserve">        -- Customer_ID = 0 represents anonymous / missing customer.</w:t>
+      </w:r>
+    </w:p>
+    <w:p>
+      <w:r>
+        <w:t xml:space="preserve">        -- ============================================================</w:t>
+      </w:r>
+    </w:p>
+    <w:p>
+      <w:r>
+        <w:t xml:space="preserve">        INSERT INTO gold.dim_customer (</w:t>
+      </w:r>
+    </w:p>
+    <w:p>
+      <w:r>
+        <w:t xml:space="preserve">            customer_id, first_name, last_name, full_name, gender, city,</w:t>
+      </w:r>
+    </w:p>
+    <w:p>
+      <w:r>
+        <w:t xml:space="preserve">            loyalty_level, email</w:t>
+      </w:r>
+    </w:p>
+    <w:p>
+      <w:r>
+        <w:t xml:space="preserve">        )</w:t>
+      </w:r>
+    </w:p>
+    <w:p>
+      <w:r>
+        <w:t xml:space="preserve">        SELECT</w:t>
+      </w:r>
+    </w:p>
+    <w:p>
+      <w:r>
+        <w:t xml:space="preserve">            0,</w:t>
+      </w:r>
+    </w:p>
+    <w:p>
+      <w:r>
+        <w:t xml:space="preserve">            'Unknown',</w:t>
+      </w:r>
+    </w:p>
+    <w:p>
+      <w:r>
+        <w:t xml:space="preserve">            'Customer',</w:t>
+      </w:r>
+    </w:p>
+    <w:p>
+      <w:r>
+        <w:t xml:space="preserve">            'Unknown Customer',</w:t>
+      </w:r>
+    </w:p>
+    <w:p>
+      <w:r>
+        <w:t xml:space="preserve">            'Unknown',</w:t>
+      </w:r>
+    </w:p>
+    <w:p>
+      <w:r>
+        <w:t xml:space="preserve">            'Unknown',</w:t>
+      </w:r>
+    </w:p>
+    <w:p>
+      <w:r>
+        <w:t xml:space="preserve">            'Unknown',</w:t>
+      </w:r>
+    </w:p>
+    <w:p>
+      <w:r>
+        <w:t xml:space="preserve">            NULL</w:t>
+      </w:r>
+    </w:p>
+    <w:p>
+      <w:r>
+        <w:t xml:space="preserve">        UNION ALL</w:t>
+      </w:r>
+    </w:p>
+    <w:p>
+      <w:r>
+        <w:t xml:space="preserve">        SELECT</w:t>
+      </w:r>
+    </w:p>
+    <w:p>
+      <w:r>
+        <w:t xml:space="preserve">            Customer_ID,</w:t>
+      </w:r>
+    </w:p>
+    <w:p>
+      <w:r>
+        <w:t xml:space="preserve">            First_Name,</w:t>
+      </w:r>
+    </w:p>
+    <w:p>
+      <w:r>
+        <w:t xml:space="preserve">            Last_Name,</w:t>
+      </w:r>
+    </w:p>
+    <w:p>
+      <w:r>
+        <w:t xml:space="preserve">            Full_Name,</w:t>
+      </w:r>
+    </w:p>
+    <w:p>
+      <w:r>
+        <w:t xml:space="preserve">            Gender,</w:t>
+      </w:r>
+    </w:p>
+    <w:p>
+      <w:r>
+        <w:t xml:space="preserve">            City,</w:t>
+      </w:r>
+    </w:p>
+    <w:p>
+      <w:r>
+        <w:t xml:space="preserve">            Loyalty_Level,</w:t>
+      </w:r>
+    </w:p>
+    <w:p>
+      <w:r>
+        <w:t xml:space="preserve">            Email</w:t>
+      </w:r>
+    </w:p>
+    <w:p>
+      <w:r>
+        <w:t xml:space="preserve">        FROM silver.customers;</w:t>
+      </w:r>
+    </w:p>
+    <w:p>
+      <w:r>
+        <w:t xml:space="preserve"/>
+      </w:r>
+    </w:p>
+    <w:p>
+      <w:r>
+        <w:t xml:space="preserve">        PRINT 'Loaded gold.dim_customer rows: ' + CAST(@@ROWCOUNT AS NVARCHAR(20));</w:t>
+      </w:r>
+    </w:p>
+    <w:p>
+      <w:r>
+        <w:t xml:space="preserve"/>
+      </w:r>
+    </w:p>
+    <w:p>
+      <w:r>
+        <w:t xml:space="preserve">        -- ============================================================</w:t>
+      </w:r>
+    </w:p>
+    <w:p>
+      <w:r>
+        <w:t xml:space="preserve">        -- CONFORMED PRODUCT DIMENSION</w:t>
+      </w:r>
+    </w:p>
+    <w:p>
+      <w:r>
+        <w:t xml:space="preserve">        -- Product_ID = 0 represents missing product references.</w:t>
+      </w:r>
+    </w:p>
+    <w:p>
+      <w:r>
+        <w:t xml:space="preserve">        -- ============================================================</w:t>
+      </w:r>
+    </w:p>
+    <w:p>
+      <w:r>
+        <w:t xml:space="preserve">        INSERT INTO gold.dim_product (</w:t>
+      </w:r>
+    </w:p>
+    <w:p>
+      <w:r>
+        <w:t xml:space="preserve">            product_id, sku, product_name, brand_id, brand_name,</w:t>
+      </w:r>
+    </w:p>
+    <w:p>
+      <w:r>
+        <w:t xml:space="preserve">            department_id, department_name, package_size</w:t>
+      </w:r>
+    </w:p>
+    <w:p>
+      <w:r>
+        <w:t xml:space="preserve">        )</w:t>
+      </w:r>
+    </w:p>
+    <w:p>
+      <w:r>
+        <w:t xml:space="preserve">        SELECT</w:t>
+      </w:r>
+    </w:p>
+    <w:p>
+      <w:r>
+        <w:t xml:space="preserve">            0,</w:t>
+      </w:r>
+    </w:p>
+    <w:p>
+      <w:r>
+        <w:t xml:space="preserve">            'UNKNOWN',</w:t>
+      </w:r>
+    </w:p>
+    <w:p>
+      <w:r>
+        <w:t xml:space="preserve">            'Unknown Product',</w:t>
+      </w:r>
+    </w:p>
+    <w:p>
+      <w:r>
+        <w:t xml:space="preserve">            NULL,</w:t>
+      </w:r>
+    </w:p>
+    <w:p>
+      <w:r>
+        <w:t xml:space="preserve">            'Unknown',</w:t>
+      </w:r>
+    </w:p>
+    <w:p>
+      <w:r>
+        <w:t xml:space="preserve">            NULL,</w:t>
+      </w:r>
+    </w:p>
+    <w:p>
+      <w:r>
+        <w:t xml:space="preserve">            'Unknown',</w:t>
+      </w:r>
+    </w:p>
+    <w:p>
+      <w:r>
+        <w:t xml:space="preserve">            'N/A'</w:t>
+      </w:r>
+    </w:p>
+    <w:p>
+      <w:r>
+        <w:t xml:space="preserve">        UNION ALL</w:t>
+      </w:r>
+    </w:p>
+    <w:p>
+      <w:r>
+        <w:t xml:space="preserve">        SELECT</w:t>
+      </w:r>
+    </w:p>
+    <w:p>
+      <w:r>
+        <w:t xml:space="preserve">            Product_ID,</w:t>
+      </w:r>
+    </w:p>
+    <w:p>
+      <w:r>
+        <w:t xml:space="preserve">            SKU,</w:t>
+      </w:r>
+    </w:p>
+    <w:p>
+      <w:r>
+        <w:t xml:space="preserve">            Product_Name,</w:t>
+      </w:r>
+    </w:p>
+    <w:p>
+      <w:r>
+        <w:t xml:space="preserve">            Brand_ID,</w:t>
+      </w:r>
+    </w:p>
+    <w:p>
+      <w:r>
+        <w:t xml:space="preserve">            Brand_Name,</w:t>
+      </w:r>
+    </w:p>
+    <w:p>
+      <w:r>
+        <w:t xml:space="preserve">            Department_ID,</w:t>
+      </w:r>
+    </w:p>
+    <w:p>
+      <w:r>
+        <w:t xml:space="preserve">            Department_Name,</w:t>
+      </w:r>
+    </w:p>
+    <w:p>
+      <w:r>
+        <w:t xml:space="preserve">            Package_Size</w:t>
+      </w:r>
+    </w:p>
+    <w:p>
+      <w:r>
+        <w:t xml:space="preserve">        FROM silver.products;</w:t>
+      </w:r>
+    </w:p>
+    <w:p>
+      <w:r>
+        <w:t xml:space="preserve"/>
+      </w:r>
+    </w:p>
+    <w:p>
+      <w:r>
+        <w:t xml:space="preserve">        PRINT 'Loaded gold.dim_product rows: ' + CAST(@@ROWCOUNT AS NVARCHAR(20));</w:t>
+      </w:r>
+    </w:p>
+    <w:p>
+      <w:r>
+        <w:t xml:space="preserve"/>
+      </w:r>
+    </w:p>
+    <w:p>
+      <w:r>
+        <w:t xml:space="preserve">        -- ============================================================</w:t>
+      </w:r>
+    </w:p>
+    <w:p>
+      <w:r>
+        <w:t xml:space="preserve">        -- CONFORMED PROMOTION DIMENSION</w:t>
+      </w:r>
+    </w:p>
+    <w:p>
+      <w:r>
+        <w:t xml:space="preserve">        -- Promotion_ID = 0 represents no promotion.</w:t>
+      </w:r>
+    </w:p>
+    <w:p>
+      <w:r>
+        <w:t xml:space="preserve">        -- ============================================================</w:t>
+      </w:r>
+    </w:p>
+    <w:p>
+      <w:r>
+        <w:t xml:space="preserve">        INSERT INTO gold.dim_promotion (</w:t>
+      </w:r>
+    </w:p>
+    <w:p>
+      <w:r>
+        <w:t xml:space="preserve">            promotion_id, promo_type, discount_percent, start_date,</w:t>
+      </w:r>
+    </w:p>
+    <w:p>
+      <w:r>
+        <w:t xml:space="preserve">            end_date, promo_duration_days</w:t>
+      </w:r>
+    </w:p>
+    <w:p>
+      <w:r>
+        <w:t xml:space="preserve">        )</w:t>
+      </w:r>
+    </w:p>
+    <w:p>
+      <w:r>
+        <w:t xml:space="preserve">        SELECT</w:t>
+      </w:r>
+    </w:p>
+    <w:p>
+      <w:r>
+        <w:t xml:space="preserve">            0,</w:t>
+      </w:r>
+    </w:p>
+    <w:p>
+      <w:r>
+        <w:t xml:space="preserve">            'No Promotion',</w:t>
+      </w:r>
+    </w:p>
+    <w:p>
+      <w:r>
+        <w:t xml:space="preserve">            0.00,</w:t>
+      </w:r>
+    </w:p>
+    <w:p>
+      <w:r>
+        <w:t xml:space="preserve">            NULL,</w:t>
+      </w:r>
+    </w:p>
+    <w:p>
+      <w:r>
+        <w:t xml:space="preserve">            NULL,</w:t>
+      </w:r>
+    </w:p>
+    <w:p>
+      <w:r>
+        <w:t xml:space="preserve">            NULL</w:t>
+      </w:r>
+    </w:p>
+    <w:p>
+      <w:r>
+        <w:t xml:space="preserve">        UNION ALL</w:t>
+      </w:r>
+    </w:p>
+    <w:p>
+      <w:r>
+        <w:t xml:space="preserve">        SELECT</w:t>
+      </w:r>
+    </w:p>
+    <w:p>
+      <w:r>
+        <w:t xml:space="preserve">            Promotion_ID,</w:t>
+      </w:r>
+    </w:p>
+    <w:p>
+      <w:r>
+        <w:t xml:space="preserve">            Promo_Type,</w:t>
+      </w:r>
+    </w:p>
+    <w:p>
+      <w:r>
+        <w:t xml:space="preserve">            Discount_Percent,</w:t>
+      </w:r>
+    </w:p>
+    <w:p>
+      <w:r>
+        <w:t xml:space="preserve">            Start_Date,</w:t>
+      </w:r>
+    </w:p>
+    <w:p>
+      <w:r>
+        <w:t xml:space="preserve">            End_Date,</w:t>
+      </w:r>
+    </w:p>
+    <w:p>
+      <w:r>
+        <w:t xml:space="preserve">            Promo_Duration_Days</w:t>
+      </w:r>
+    </w:p>
+    <w:p>
+      <w:r>
+        <w:t xml:space="preserve">        FROM silver.promotions;</w:t>
+      </w:r>
+    </w:p>
+    <w:p>
+      <w:r>
+        <w:t xml:space="preserve"/>
+      </w:r>
+    </w:p>
+    <w:p>
+      <w:r>
+        <w:t xml:space="preserve">        PRINT 'Loaded gold.dim_promotion rows: ' + CAST(@@ROWCOUNT AS NVARCHAR(20));</w:t>
+      </w:r>
+    </w:p>
+    <w:p>
+      <w:r>
+        <w:t xml:space="preserve"/>
+      </w:r>
+    </w:p>
+    <w:p>
+      <w:r>
+        <w:t xml:space="preserve">        -- ============================================================</w:t>
+      </w:r>
+    </w:p>
+    <w:p>
+      <w:r>
+        <w:t xml:space="preserve">        -- STORE, EMPLOYEE, WAREHOUSE DIMENSIONS</w:t>
+      </w:r>
+    </w:p>
+    <w:p>
+      <w:r>
+        <w:t xml:space="preserve">        -- ============================================================</w:t>
+      </w:r>
+    </w:p>
+    <w:p>
+      <w:r>
+        <w:t xml:space="preserve">        INSERT INTO gold.dim_store (</w:t>
+      </w:r>
+    </w:p>
+    <w:p>
+      <w:r>
+        <w:t xml:space="preserve">            store_id, store_name, city, state, region, opening_date</w:t>
+      </w:r>
+    </w:p>
+    <w:p>
+      <w:r>
+        <w:t xml:space="preserve">        )</w:t>
+      </w:r>
+    </w:p>
+    <w:p>
+      <w:r>
+        <w:t xml:space="preserve">        SELECT</w:t>
+      </w:r>
+    </w:p>
+    <w:p>
+      <w:r>
+        <w:t xml:space="preserve">            0,</w:t>
+      </w:r>
+    </w:p>
+    <w:p>
+      <w:r>
+        <w:t xml:space="preserve">            'Unknown Store',</w:t>
+      </w:r>
+    </w:p>
+    <w:p>
+      <w:r>
+        <w:t xml:space="preserve">            'Unknown',</w:t>
+      </w:r>
+    </w:p>
+    <w:p>
+      <w:r>
+        <w:t xml:space="preserve">            'Unknown',</w:t>
+      </w:r>
+    </w:p>
+    <w:p>
+      <w:r>
+        <w:t xml:space="preserve">            'Unknown',</w:t>
+      </w:r>
+    </w:p>
+    <w:p>
+      <w:r>
+        <w:t xml:space="preserve">            NULL</w:t>
+      </w:r>
+    </w:p>
+    <w:p>
+      <w:r>
+        <w:t xml:space="preserve">        UNION ALL</w:t>
+      </w:r>
+    </w:p>
+    <w:p>
+      <w:r>
+        <w:t xml:space="preserve">        SELECT</w:t>
+      </w:r>
+    </w:p>
+    <w:p>
+      <w:r>
+        <w:t xml:space="preserve">            Store_ID,</w:t>
+      </w:r>
+    </w:p>
+    <w:p>
+      <w:r>
+        <w:t xml:space="preserve">            Store_Name,</w:t>
+      </w:r>
+    </w:p>
+    <w:p>
+      <w:r>
+        <w:t xml:space="preserve">            City,</w:t>
+      </w:r>
+    </w:p>
+    <w:p>
+      <w:r>
+        <w:t xml:space="preserve">            State,</w:t>
+      </w:r>
+    </w:p>
+    <w:p>
+      <w:r>
+        <w:t xml:space="preserve">            Region,</w:t>
+      </w:r>
+    </w:p>
+    <w:p>
+      <w:r>
+        <w:t xml:space="preserve">            Opening_Date</w:t>
+      </w:r>
+    </w:p>
+    <w:p>
+      <w:r>
+        <w:t xml:space="preserve">        FROM silver.stores;</w:t>
+      </w:r>
+    </w:p>
+    <w:p>
+      <w:r>
+        <w:t xml:space="preserve"/>
+      </w:r>
+    </w:p>
+    <w:p>
+      <w:r>
+        <w:t xml:space="preserve">        PRINT 'Loaded gold.dim_store rows: ' + CAST(@@ROWCOUNT AS NVARCHAR(20));</w:t>
+      </w:r>
+    </w:p>
+    <w:p>
+      <w:r>
+        <w:t xml:space="preserve"/>
+      </w:r>
+    </w:p>
+    <w:p>
+      <w:r>
+        <w:t xml:space="preserve">        INSERT INTO gold.dim_employee (</w:t>
+      </w:r>
+    </w:p>
+    <w:p>
+      <w:r>
+        <w:t xml:space="preserve">            employee_id, employee_name, gender, position, store_id,</w:t>
+      </w:r>
+    </w:p>
+    <w:p>
+      <w:r>
+        <w:t xml:space="preserve">            hire_date, tenure_years</w:t>
+      </w:r>
+    </w:p>
+    <w:p>
+      <w:r>
+        <w:t xml:space="preserve">        )</w:t>
+      </w:r>
+    </w:p>
+    <w:p>
+      <w:r>
+        <w:t xml:space="preserve">        SELECT</w:t>
+      </w:r>
+    </w:p>
+    <w:p>
+      <w:r>
+        <w:t xml:space="preserve">            0,</w:t>
+      </w:r>
+    </w:p>
+    <w:p>
+      <w:r>
+        <w:t xml:space="preserve">            'Unknown Employee',</w:t>
+      </w:r>
+    </w:p>
+    <w:p>
+      <w:r>
+        <w:t xml:space="preserve">            'Unknown',</w:t>
+      </w:r>
+    </w:p>
+    <w:p>
+      <w:r>
+        <w:t xml:space="preserve">            'Unknown',</w:t>
+      </w:r>
+    </w:p>
+    <w:p>
+      <w:r>
+        <w:t xml:space="preserve">            0,</w:t>
+      </w:r>
+    </w:p>
+    <w:p>
+      <w:r>
+        <w:t xml:space="preserve">            NULL,</w:t>
+      </w:r>
+    </w:p>
+    <w:p>
+      <w:r>
+        <w:t xml:space="preserve">            NULL</w:t>
+      </w:r>
+    </w:p>
+    <w:p>
+      <w:r>
+        <w:t xml:space="preserve">        UNION ALL</w:t>
+      </w:r>
+    </w:p>
+    <w:p>
+      <w:r>
+        <w:t xml:space="preserve">        SELECT</w:t>
+      </w:r>
+    </w:p>
+    <w:p>
+      <w:r>
+        <w:t xml:space="preserve">            Employee_ID,</w:t>
+      </w:r>
+    </w:p>
+    <w:p>
+      <w:r>
+        <w:t xml:space="preserve">            Name,</w:t>
+      </w:r>
+    </w:p>
+    <w:p>
+      <w:r>
+        <w:t xml:space="preserve">            Gender,</w:t>
+      </w:r>
+    </w:p>
+    <w:p>
+      <w:r>
+        <w:t xml:space="preserve">            Position,</w:t>
+      </w:r>
+    </w:p>
+    <w:p>
+      <w:r>
+        <w:t xml:space="preserve">            Store_ID,</w:t>
+      </w:r>
+    </w:p>
+    <w:p>
+      <w:r>
+        <w:t xml:space="preserve">            Hire_Date,</w:t>
+      </w:r>
+    </w:p>
+    <w:p>
+      <w:r>
+        <w:t xml:space="preserve">            Tenure_Years</w:t>
+      </w:r>
+    </w:p>
+    <w:p>
+      <w:r>
+        <w:t xml:space="preserve">        FROM silver.employees;</w:t>
+      </w:r>
+    </w:p>
+    <w:p>
+      <w:r>
+        <w:t xml:space="preserve"/>
+      </w:r>
+    </w:p>
+    <w:p>
+      <w:r>
+        <w:t xml:space="preserve">        PRINT 'Loaded gold.dim_employee rows: ' + CAST(@@ROWCOUNT AS NVARCHAR(20));</w:t>
+      </w:r>
+    </w:p>
+    <w:p>
+      <w:r>
+        <w:t xml:space="preserve"/>
+      </w:r>
+    </w:p>
+    <w:p>
+      <w:r>
+        <w:t xml:space="preserve">        INSERT INTO gold.dim_warehouse (</w:t>
+      </w:r>
+    </w:p>
+    <w:p>
+      <w:r>
+        <w:t xml:space="preserve">            warehouse_id, warehouse_name, city, state</w:t>
+      </w:r>
+    </w:p>
+    <w:p>
+      <w:r>
+        <w:t xml:space="preserve">        )</w:t>
+      </w:r>
+    </w:p>
+    <w:p>
+      <w:r>
+        <w:t xml:space="preserve">        SELECT</w:t>
+      </w:r>
+    </w:p>
+    <w:p>
+      <w:r>
+        <w:t xml:space="preserve">            0,</w:t>
+      </w:r>
+    </w:p>
+    <w:p>
+      <w:r>
+        <w:t xml:space="preserve">            'Unknown Warehouse',</w:t>
+      </w:r>
+    </w:p>
+    <w:p>
+      <w:r>
+        <w:t xml:space="preserve">            'Unknown',</w:t>
+      </w:r>
+    </w:p>
+    <w:p>
+      <w:r>
+        <w:t xml:space="preserve">            'Unknown'</w:t>
+      </w:r>
+    </w:p>
+    <w:p>
+      <w:r>
+        <w:t xml:space="preserve">        UNION ALL</w:t>
+      </w:r>
+    </w:p>
+    <w:p>
+      <w:r>
+        <w:t xml:space="preserve">        SELECT</w:t>
+      </w:r>
+    </w:p>
+    <w:p>
+      <w:r>
+        <w:t xml:space="preserve">            Warehouse_ID,</w:t>
+      </w:r>
+    </w:p>
+    <w:p>
+      <w:r>
+        <w:t xml:space="preserve">            Warehouse_Name,</w:t>
+      </w:r>
+    </w:p>
+    <w:p>
+      <w:r>
+        <w:t xml:space="preserve">            City,</w:t>
+      </w:r>
+    </w:p>
+    <w:p>
+      <w:r>
+        <w:t xml:space="preserve">            State</w:t>
+      </w:r>
+    </w:p>
+    <w:p>
+      <w:r>
+        <w:t xml:space="preserve">        FROM silver.warehouses;</w:t>
+      </w:r>
+    </w:p>
+    <w:p>
+      <w:r>
+        <w:t xml:space="preserve"/>
+      </w:r>
+    </w:p>
+    <w:p>
+      <w:r>
+        <w:t xml:space="preserve">        PRINT 'Loaded gold.dim_warehouse rows: ' + CAST(@@ROWCOUNT AS NVARCHAR(20));</w:t>
+      </w:r>
+    </w:p>
+    <w:p>
+      <w:r>
+        <w:t xml:space="preserve"/>
+      </w:r>
+    </w:p>
+    <w:p>
+      <w:r>
+        <w:t xml:space="preserve">        -- ============================================================</w:t>
+      </w:r>
+    </w:p>
+    <w:p>
+      <w:r>
+        <w:t xml:space="preserve">        -- ONLINE SALES SUPPORTING DIMENSIONS</w:t>
+      </w:r>
+    </w:p>
+    <w:p>
+      <w:r>
+        <w:t xml:space="preserve">        -- ============================================================</w:t>
+      </w:r>
+    </w:p>
+    <w:p>
+      <w:r>
+        <w:t xml:space="preserve">        INSERT INTO gold.dim_order_status (</w:t>
+      </w:r>
+    </w:p>
+    <w:p>
+      <w:r>
+        <w:t xml:space="preserve">            status_name, status_description</w:t>
+      </w:r>
+    </w:p>
+    <w:p>
+      <w:r>
+        <w:t xml:space="preserve">        )</w:t>
+      </w:r>
+    </w:p>
+    <w:p>
+      <w:r>
+        <w:t xml:space="preserve">        SELECT</w:t>
+      </w:r>
+    </w:p>
+    <w:p>
+      <w:r>
+        <w:t xml:space="preserve">            'Unknown',</w:t>
+      </w:r>
+    </w:p>
+    <w:p>
+      <w:r>
+        <w:t xml:space="preserve">            'Unknown or missing online order status'</w:t>
+      </w:r>
+    </w:p>
+    <w:p>
+      <w:r>
+        <w:t xml:space="preserve">        UNION</w:t>
+      </w:r>
+    </w:p>
+    <w:p>
+      <w:r>
+        <w:t xml:space="preserve">        SELECT DISTINCT</w:t>
+      </w:r>
+    </w:p>
+    <w:p>
+      <w:r>
+        <w:t xml:space="preserve">            Order_Status,</w:t>
+      </w:r>
+    </w:p>
+    <w:p>
+      <w:r>
+        <w:t xml:space="preserve">            CASE</w:t>
+      </w:r>
+    </w:p>
+    <w:p>
+      <w:r>
+        <w:t xml:space="preserve">                WHEN Order_Status = 'Delivered' THEN 'Order completed and delivered to the customer'</w:t>
+      </w:r>
+    </w:p>
+    <w:p>
+      <w:r>
+        <w:t xml:space="preserve">                WHEN Order_Status = 'Pending' THEN 'Order has been placed and is awaiting completion'</w:t>
+      </w:r>
+    </w:p>
+    <w:p>
+      <w:r>
+        <w:t xml:space="preserve">                WHEN Order_Status = 'Cancelled' THEN 'Order was cancelled before completion'</w:t>
+      </w:r>
+    </w:p>
+    <w:p>
+      <w:r>
+        <w:t xml:space="preserve">                WHEN Order_Status = 'Shipped' THEN 'Order has shipped and is in transit'</w:t>
+      </w:r>
+    </w:p>
+    <w:p>
+      <w:r>
+        <w:t xml:space="preserve">                ELSE 'Operational online order status'</w:t>
+      </w:r>
+    </w:p>
+    <w:p>
+      <w:r>
+        <w:t xml:space="preserve">            END</w:t>
+      </w:r>
+    </w:p>
+    <w:p>
+      <w:r>
+        <w:t xml:space="preserve">        FROM silver.online_orders</w:t>
+      </w:r>
+    </w:p>
+    <w:p>
+      <w:r>
+        <w:t xml:space="preserve">        WHERE Order_Status IS NOT NULL;</w:t>
+      </w:r>
+    </w:p>
+    <w:p>
+      <w:r>
+        <w:t xml:space="preserve"/>
+      </w:r>
+    </w:p>
+    <w:p>
+      <w:r>
+        <w:t xml:space="preserve">        PRINT 'Loaded gold.dim_order_status rows: ' + CAST(@@ROWCOUNT AS NVARCHAR(20));</w:t>
+      </w:r>
+    </w:p>
+    <w:p>
+      <w:r>
+        <w:t xml:space="preserve"/>
+      </w:r>
+    </w:p>
+    <w:p>
+      <w:r>
+        <w:t xml:space="preserve">        INSERT INTO gold.dim_payment_method (</w:t>
+      </w:r>
+    </w:p>
+    <w:p>
+      <w:r>
+        <w:t xml:space="preserve">            payment_method_name, payment_provider</w:t>
+      </w:r>
+    </w:p>
+    <w:p>
+      <w:r>
+        <w:t xml:space="preserve">        )</w:t>
+      </w:r>
+    </w:p>
+    <w:p>
+      <w:r>
+        <w:t xml:space="preserve">        SELECT</w:t>
+      </w:r>
+    </w:p>
+    <w:p>
+      <w:r>
+        <w:t xml:space="preserve">            'Unknown',</w:t>
+      </w:r>
+    </w:p>
+    <w:p>
+      <w:r>
+        <w:t xml:space="preserve">            'Unknown'</w:t>
+      </w:r>
+    </w:p>
+    <w:p>
+      <w:r>
+        <w:t xml:space="preserve">        UNION</w:t>
+      </w:r>
+    </w:p>
+    <w:p>
+      <w:r>
+        <w:t xml:space="preserve">        SELECT DISTINCT</w:t>
+      </w:r>
+    </w:p>
+    <w:p>
+      <w:r>
+        <w:t xml:space="preserve">            Payment_Method,</w:t>
+      </w:r>
+    </w:p>
+    <w:p>
+      <w:r>
+        <w:t xml:space="preserve">            Payment_Method</w:t>
+      </w:r>
+    </w:p>
+    <w:p>
+      <w:r>
+        <w:t xml:space="preserve">        FROM silver.payments</w:t>
+      </w:r>
+    </w:p>
+    <w:p>
+      <w:r>
+        <w:t xml:space="preserve">        WHERE Payment_Method IS NOT NULL;</w:t>
+      </w:r>
+    </w:p>
+    <w:p>
+      <w:r>
+        <w:t xml:space="preserve"/>
+      </w:r>
+    </w:p>
+    <w:p>
+      <w:r>
+        <w:t xml:space="preserve">        PRINT 'Loaded gold.dim_payment_method rows: ' + CAST(@@ROWCOUNT AS NVARCHAR(20));</w:t>
+      </w:r>
+    </w:p>
+    <w:p>
+      <w:r>
+        <w:t xml:space="preserve"/>
+      </w:r>
+    </w:p>
+    <w:p>
+      <w:r>
+        <w:t xml:space="preserve">        -- ============================================================</w:t>
+      </w:r>
+    </w:p>
+    <w:p>
+      <w:r>
+        <w:t xml:space="preserve">        -- FACT 1: STORE SALES PERFORMANCE</w:t>
+      </w:r>
+    </w:p>
+    <w:p>
+      <w:r>
+        <w:t xml:space="preserve">        -- Grain: one POS transaction line item.</w:t>
+      </w:r>
+    </w:p>
+    <w:p>
+      <w:r>
+        <w:t xml:space="preserve">        -- ============================================================</w:t>
+      </w:r>
+    </w:p>
+    <w:p>
+      <w:r>
+        <w:t xml:space="preserve">        INSERT INTO gold.fact_store_sales (</w:t>
+      </w:r>
+    </w:p>
+    <w:p>
+      <w:r>
+        <w:t xml:space="preserve">            date_key, store_key, product_key, customer_key, employee_key,</w:t>
+      </w:r>
+    </w:p>
+    <w:p>
+      <w:r>
+        <w:t xml:space="preserve">            promotion_key, source_line_number, transaction_number, transaction_time,</w:t>
+      </w:r>
+    </w:p>
+    <w:p>
+      <w:r>
+        <w:t xml:space="preserve">            quantity, unit_price, gross_sales_amount, discount_percent,</w:t>
+      </w:r>
+    </w:p>
+    <w:p>
+      <w:r>
+        <w:t xml:space="preserve">            discount_amount, net_sales_amount</w:t>
+      </w:r>
+    </w:p>
+    <w:p>
+      <w:r>
+        <w:t xml:space="preserve">        )</w:t>
+      </w:r>
+    </w:p>
+    <w:p>
+      <w:r>
+        <w:t xml:space="preserve">        SELECT</w:t>
+      </w:r>
+    </w:p>
+    <w:p>
+      <w:r>
+        <w:t xml:space="preserve">            dd.date_key,</w:t>
+      </w:r>
+    </w:p>
+    <w:p>
+      <w:r>
+        <w:t xml:space="preserve">            COALESCE(ds.store_key, ds_unknown.store_key),</w:t>
+      </w:r>
+    </w:p>
+    <w:p>
+      <w:r>
+        <w:t xml:space="preserve">            COALESCE(dp.product_key, dp_unknown.product_key),</w:t>
+      </w:r>
+    </w:p>
+    <w:p>
+      <w:r>
+        <w:t xml:space="preserve">            COALESCE(dc.customer_key, dc_unknown.customer_key),</w:t>
+      </w:r>
+    </w:p>
+    <w:p>
+      <w:r>
+        <w:t xml:space="preserve">            COALESCE(de.employee_key, de_unknown.employee_key),</w:t>
+      </w:r>
+    </w:p>
+    <w:p>
+      <w:r>
+        <w:t xml:space="preserve">            COALESCE(dpr.promotion_key, dpr_none.promotion_key),</w:t>
+      </w:r>
+    </w:p>
+    <w:p>
+      <w:r>
+        <w:t xml:space="preserve">            ti.Line_ID,</w:t>
+      </w:r>
+    </w:p>
+    <w:p>
+      <w:r>
+        <w:t xml:space="preserve">            ti.Transaction_ID,</w:t>
+      </w:r>
+    </w:p>
+    <w:p>
+      <w:r>
+        <w:t xml:space="preserve">            pt.Transaction_Time,</w:t>
+      </w:r>
+    </w:p>
+    <w:p>
+      <w:r>
+        <w:t xml:space="preserve">            ti.Quantity,</w:t>
+      </w:r>
+    </w:p>
+    <w:p>
+      <w:r>
+        <w:t xml:space="preserve">            ti.Unit_Price,</w:t>
+      </w:r>
+    </w:p>
+    <w:p>
+      <w:r>
+        <w:t xml:space="preserve">            ti.Sales_Amount,</w:t>
+      </w:r>
+    </w:p>
+    <w:p>
+      <w:r>
+        <w:t xml:space="preserve">            ISNULL(ti.Discount_Percent, 0),</w:t>
+      </w:r>
+    </w:p>
+    <w:p>
+      <w:r>
+        <w:t xml:space="preserve">            ISNULL(ti.Discount_Amount, 0),</w:t>
+      </w:r>
+    </w:p>
+    <w:p>
+      <w:r>
+        <w:t xml:space="preserve">            ISNULL(ti.Net_Sales_Amount, ti.Sales_Amount)</w:t>
+      </w:r>
+    </w:p>
+    <w:p>
+      <w:r>
+        <w:t xml:space="preserve">        FROM silver.transaction_items ti</w:t>
+      </w:r>
+    </w:p>
+    <w:p>
+      <w:r>
+        <w:t xml:space="preserve">        LEFT JOIN silver.pos_transactions pt</w:t>
+      </w:r>
+    </w:p>
+    <w:p>
+      <w:r>
+        <w:t xml:space="preserve">            ON ti.Transaction_ID = pt.Transaction_ID</w:t>
+      </w:r>
+    </w:p>
+    <w:p>
+      <w:r>
+        <w:t xml:space="preserve">        JOIN gold.dim_date dd</w:t>
+      </w:r>
+    </w:p>
+    <w:p>
+      <w:r>
+        <w:t xml:space="preserve">            ON dd.full_date = ISNULL(pt.Transaction_Date, CAST('19000101' AS DATE))</w:t>
+      </w:r>
+    </w:p>
+    <w:p>
+      <w:r>
+        <w:t xml:space="preserve">        LEFT JOIN gold.dim_store ds</w:t>
+      </w:r>
+    </w:p>
+    <w:p>
+      <w:r>
+        <w:t xml:space="preserve">            ON ds.store_id = ISNULL(pt.Store_ID, 0)</w:t>
+      </w:r>
+    </w:p>
+    <w:p>
+      <w:r>
+        <w:t xml:space="preserve">        CROSS JOIN (SELECT store_key FROM gold.dim_store WHERE store_id = 0) ds_unknown</w:t>
+      </w:r>
+    </w:p>
+    <w:p>
+      <w:r>
+        <w:t xml:space="preserve">        LEFT JOIN gold.dim_product dp</w:t>
+      </w:r>
+    </w:p>
+    <w:p>
+      <w:r>
+        <w:t xml:space="preserve">            ON dp.product_id = ISNULL(ti.Product_ID, 0)</w:t>
+      </w:r>
+    </w:p>
+    <w:p>
+      <w:r>
+        <w:t xml:space="preserve">        CROSS JOIN (SELECT product_key FROM gold.dim_product WHERE product_id = 0) dp_unknown</w:t>
+      </w:r>
+    </w:p>
+    <w:p>
+      <w:r>
+        <w:t xml:space="preserve">        LEFT JOIN gold.dim_customer dc</w:t>
+      </w:r>
+    </w:p>
+    <w:p>
+      <w:r>
+        <w:t xml:space="preserve">            ON dc.customer_id = ISNULL(pt.Customer_ID, 0)</w:t>
+      </w:r>
+    </w:p>
+    <w:p>
+      <w:r>
+        <w:t xml:space="preserve">        CROSS JOIN (SELECT customer_key FROM gold.dim_customer WHERE customer_id = 0) dc_unknown</w:t>
+      </w:r>
+    </w:p>
+    <w:p>
+      <w:r>
+        <w:t xml:space="preserve">        LEFT JOIN gold.dim_employee de</w:t>
+      </w:r>
+    </w:p>
+    <w:p>
+      <w:r>
+        <w:t xml:space="preserve">            ON de.employee_id = ISNULL(pt.Employee_ID, 0)</w:t>
+      </w:r>
+    </w:p>
+    <w:p>
+      <w:r>
+        <w:t xml:space="preserve">        CROSS JOIN (SELECT employee_key FROM gold.dim_employee WHERE employee_id = 0) de_unknown</w:t>
+      </w:r>
+    </w:p>
+    <w:p>
+      <w:r>
+        <w:t xml:space="preserve">        LEFT JOIN gold.dim_promotion dpr</w:t>
+      </w:r>
+    </w:p>
+    <w:p>
+      <w:r>
+        <w:t xml:space="preserve">            ON dpr.promotion_id = ISNULL(ti.Promotion_ID, 0)</w:t>
+      </w:r>
+    </w:p>
+    <w:p>
+      <w:r>
+        <w:t xml:space="preserve">        CROSS JOIN (SELECT promotion_key FROM gold.dim_promotion WHERE promotion_id = 0) dpr_none;</w:t>
+      </w:r>
+    </w:p>
+    <w:p>
+      <w:r>
+        <w:t xml:space="preserve"/>
+      </w:r>
+    </w:p>
+    <w:p>
+      <w:r>
+        <w:t xml:space="preserve">        PRINT 'Loaded gold.fact_store_sales rows: ' + CAST(@@ROWCOUNT AS NVARCHAR(20));</w:t>
+      </w:r>
+    </w:p>
+    <w:p>
+      <w:r>
+        <w:t xml:space="preserve"/>
+      </w:r>
+    </w:p>
+    <w:p>
+      <w:r>
+        <w:t xml:space="preserve">        -- ============================================================</w:t>
+      </w:r>
+    </w:p>
+    <w:p>
+      <w:r>
+        <w:t xml:space="preserve">        -- FACT 2: ONLINE SALES PERFORMANCE</w:t>
+      </w:r>
+    </w:p>
+    <w:p>
+      <w:r>
+        <w:t xml:space="preserve">        -- Grain: one online order line item.</w:t>
+      </w:r>
+    </w:p>
+    <w:p>
+      <w:r>
+        <w:t xml:space="preserve">        -- ============================================================</w:t>
+      </w:r>
+    </w:p>
+    <w:p>
+      <w:r>
+        <w:t xml:space="preserve">        INSERT INTO gold.fact_online_sales (</w:t>
+      </w:r>
+    </w:p>
+    <w:p>
+      <w:r>
+        <w:t xml:space="preserve">            date_key, customer_key, product_key, warehouse_key,</w:t>
+      </w:r>
+    </w:p>
+    <w:p>
+      <w:r>
+        <w:t xml:space="preserve">            promotion_key, order_status_key, payment_method_key,</w:t>
+      </w:r>
+    </w:p>
+    <w:p>
+      <w:r>
+        <w:t xml:space="preserve">            source_order_item_number, source_order_number,</w:t>
+      </w:r>
+    </w:p>
+    <w:p>
+      <w:r>
+        <w:t xml:space="preserve">            quantity, unit_price, gross_sales_amount, discount_percent,</w:t>
+      </w:r>
+    </w:p>
+    <w:p>
+      <w:r>
+        <w:t xml:space="preserve">            discount_amount, net_sales_amount, order_total</w:t>
+      </w:r>
+    </w:p>
+    <w:p>
+      <w:r>
+        <w:t xml:space="preserve">        )</w:t>
+      </w:r>
+    </w:p>
+    <w:p>
+      <w:r>
+        <w:t xml:space="preserve">        SELECT</w:t>
+      </w:r>
+    </w:p>
+    <w:p>
+      <w:r>
+        <w:t xml:space="preserve">            dd.date_key,</w:t>
+      </w:r>
+    </w:p>
+    <w:p>
+      <w:r>
+        <w:t xml:space="preserve">            COALESCE(dc.customer_key, dc_unknown.customer_key),</w:t>
+      </w:r>
+    </w:p>
+    <w:p>
+      <w:r>
+        <w:t xml:space="preserve">            COALESCE(dp.product_key, dp_unknown.product_key),</w:t>
+      </w:r>
+    </w:p>
+    <w:p>
+      <w:r>
+        <w:t xml:space="preserve">            COALESCE(dw.warehouse_key, dw_unknown.warehouse_key),</w:t>
+      </w:r>
+    </w:p>
+    <w:p>
+      <w:r>
+        <w:t xml:space="preserve">            COALESCE(dpr.promotion_key, dpr_none.promotion_key),</w:t>
+      </w:r>
+    </w:p>
+    <w:p>
+      <w:r>
+        <w:t xml:space="preserve">            COALESCE(dos.order_status_key, dos_unknown.order_status_key),</w:t>
+      </w:r>
+    </w:p>
+    <w:p>
+      <w:r>
+        <w:t xml:space="preserve">            COALESCE(dpm.payment_method_key, dpm_unknown.payment_method_key),</w:t>
+      </w:r>
+    </w:p>
+    <w:p>
+      <w:r>
+        <w:t xml:space="preserve">            oi.Order_Item_ID,</w:t>
+      </w:r>
+    </w:p>
+    <w:p>
+      <w:r>
+        <w:t xml:space="preserve">            oi.Order_ID,</w:t>
+      </w:r>
+    </w:p>
+    <w:p>
+      <w:r>
+        <w:t xml:space="preserve">            oi.Quantity,</w:t>
+      </w:r>
+    </w:p>
+    <w:p>
+      <w:r>
+        <w:t xml:space="preserve">            oi.Unit_Price,</w:t>
+      </w:r>
+    </w:p>
+    <w:p>
+      <w:r>
+        <w:t xml:space="preserve">            oi.Sales_Amount,</w:t>
+      </w:r>
+    </w:p>
+    <w:p>
+      <w:r>
+        <w:t xml:space="preserve">            ISNULL(oi.Discount_Percent, 0),</w:t>
+      </w:r>
+    </w:p>
+    <w:p>
+      <w:r>
+        <w:t xml:space="preserve">            ISNULL(oi.Discount_Amount, 0),</w:t>
+      </w:r>
+    </w:p>
+    <w:p>
+      <w:r>
+        <w:t xml:space="preserve">            ISNULL(oi.Net_Sales_Amount, oi.Sales_Amount),</w:t>
+      </w:r>
+    </w:p>
+    <w:p>
+      <w:r>
+        <w:t xml:space="preserve">            oo.Order_Total</w:t>
+      </w:r>
+    </w:p>
+    <w:p>
+      <w:r>
+        <w:t xml:space="preserve">        FROM silver.online_order_items oi</w:t>
+      </w:r>
+    </w:p>
+    <w:p>
+      <w:r>
+        <w:t xml:space="preserve">        LEFT JOIN silver.online_orders oo</w:t>
+      </w:r>
+    </w:p>
+    <w:p>
+      <w:r>
+        <w:t xml:space="preserve">            ON oi.Order_ID = oo.Order_ID</w:t>
+      </w:r>
+    </w:p>
+    <w:p>
+      <w:r>
+        <w:t xml:space="preserve">        JOIN gold.dim_date dd</w:t>
+      </w:r>
+    </w:p>
+    <w:p>
+      <w:r>
+        <w:t xml:space="preserve">            ON dd.full_date = ISNULL(oo.Order_Date, CAST('19000101' AS DATE))</w:t>
+      </w:r>
+    </w:p>
+    <w:p>
+      <w:r>
+        <w:t xml:space="preserve">        LEFT JOIN gold.dim_customer dc</w:t>
+      </w:r>
+    </w:p>
+    <w:p>
+      <w:r>
+        <w:t xml:space="preserve">            ON dc.customer_id = ISNULL(oo.Customer_ID, 0)</w:t>
+      </w:r>
+    </w:p>
+    <w:p>
+      <w:r>
+        <w:t xml:space="preserve">        CROSS JOIN (SELECT customer_key FROM gold.dim_customer WHERE customer_id = 0) dc_unknown</w:t>
+      </w:r>
+    </w:p>
+    <w:p>
+      <w:r>
+        <w:t xml:space="preserve">        LEFT JOIN gold.dim_product dp</w:t>
+      </w:r>
+    </w:p>
+    <w:p>
+      <w:r>
+        <w:t xml:space="preserve">            ON dp.product_id = ISNULL(oi.Product_ID, 0)</w:t>
+      </w:r>
+    </w:p>
+    <w:p>
+      <w:r>
+        <w:t xml:space="preserve">        CROSS JOIN (SELECT product_key FROM gold.dim_product WHERE product_id = 0) dp_unknown</w:t>
+      </w:r>
+    </w:p>
+    <w:p>
+      <w:r>
+        <w:t xml:space="preserve">        LEFT JOIN gold.dim_warehouse dw</w:t>
+      </w:r>
+    </w:p>
+    <w:p>
+      <w:r>
+        <w:t xml:space="preserve">            ON dw.warehouse_id = ISNULL(oo.Warehouse_ID, 0)</w:t>
+      </w:r>
+    </w:p>
+    <w:p>
+      <w:r>
+        <w:t xml:space="preserve">        CROSS JOIN (SELECT warehouse_key FROM gold.dim_warehouse WHERE warehouse_id = 0) dw_unknown</w:t>
+      </w:r>
+    </w:p>
+    <w:p>
+      <w:r>
+        <w:t xml:space="preserve">        LEFT JOIN gold.dim_promotion dpr</w:t>
+      </w:r>
+    </w:p>
+    <w:p>
+      <w:r>
+        <w:t xml:space="preserve">            ON dpr.promotion_id = ISNULL(oi.Promotion_ID, 0)</w:t>
+      </w:r>
+    </w:p>
+    <w:p>
+      <w:r>
+        <w:t xml:space="preserve">        CROSS JOIN (SELECT promotion_key FROM gold.dim_promotion WHERE promotion_id = 0) dpr_none</w:t>
+      </w:r>
+    </w:p>
+    <w:p>
+      <w:r>
+        <w:t xml:space="preserve">        LEFT JOIN gold.dim_order_status dos</w:t>
+      </w:r>
+    </w:p>
+    <w:p>
+      <w:r>
+        <w:t xml:space="preserve">            ON dos.status_name = ISNULL(oo.Order_Status, 'Unknown')</w:t>
+      </w:r>
+    </w:p>
+    <w:p>
+      <w:r>
+        <w:t xml:space="preserve">        CROSS JOIN (SELECT order_status_key FROM gold.dim_order_status WHERE status_name = 'Unknown') dos_unknown</w:t>
+      </w:r>
+    </w:p>
+    <w:p>
+      <w:r>
+        <w:t xml:space="preserve">        LEFT JOIN (</w:t>
+      </w:r>
+    </w:p>
+    <w:p>
+      <w:r>
+        <w:t xml:space="preserve">            SELECT Order_ID, MIN(Payment_Method) AS Payment_Method</w:t>
+      </w:r>
+    </w:p>
+    <w:p>
+      <w:r>
+        <w:t xml:space="preserve">            FROM silver.payments</w:t>
+      </w:r>
+    </w:p>
+    <w:p>
+      <w:r>
+        <w:t xml:space="preserve">            GROUP BY Order_ID</w:t>
+      </w:r>
+    </w:p>
+    <w:p>
+      <w:r>
+        <w:t xml:space="preserve">        ) pay</w:t>
+      </w:r>
+    </w:p>
+    <w:p>
+      <w:r>
+        <w:t xml:space="preserve">            ON pay.Order_ID = oi.Order_ID</w:t>
+      </w:r>
+    </w:p>
+    <w:p>
+      <w:r>
+        <w:t xml:space="preserve">        LEFT JOIN gold.dim_payment_method dpm</w:t>
+      </w:r>
+    </w:p>
+    <w:p>
+      <w:r>
+        <w:t xml:space="preserve">            ON dpm.payment_method_name = ISNULL(pay.Payment_Method, 'Unknown')</w:t>
+      </w:r>
+    </w:p>
+    <w:p>
+      <w:r>
+        <w:t xml:space="preserve">        CROSS JOIN (SELECT payment_method_key FROM gold.dim_payment_method WHERE payment_method_name = 'Unknown') dpm_unknown;</w:t>
+      </w:r>
+    </w:p>
+    <w:p>
+      <w:r>
+        <w:t xml:space="preserve"/>
+      </w:r>
+    </w:p>
+    <w:p>
+      <w:r>
+        <w:t xml:space="preserve">        PRINT 'Loaded gold.fact_online_sales rows: ' + CAST(@@ROWCOUNT AS NVARCHAR(20));</w:t>
+      </w:r>
+    </w:p>
+    <w:p>
+      <w:r>
+        <w:t xml:space="preserve"/>
+      </w:r>
+    </w:p>
+    <w:p>
+      <w:r>
+        <w:t xml:space="preserve">        COMMIT TRANSACTION;</w:t>
+      </w:r>
+    </w:p>
+    <w:p>
+      <w:r>
+        <w:t xml:space="preserve"/>
+      </w:r>
+    </w:p>
+    <w:p>
+      <w:r>
+        <w:t xml:space="preserve">        PRINT '======================================================';</w:t>
+      </w:r>
+    </w:p>
+    <w:p>
+      <w:r>
+        <w:t xml:space="preserve">        PRINT 'Gold Layer Load Completed Successfully';</w:t>
+      </w:r>
+    </w:p>
+    <w:p>
+      <w:r>
+        <w:t xml:space="preserve">        PRINT 'End Time: ' + CAST(GETDATE() AS NVARCHAR(50));</w:t>
+      </w:r>
+    </w:p>
+    <w:p>
+      <w:r>
+        <w:t xml:space="preserve">        PRINT 'Duration: ' + CAST(DATEDIFF(SECOND, @start_time, GETDATE()) AS NVARCHAR(20)) + 's';</w:t>
+      </w:r>
+    </w:p>
+    <w:p>
+      <w:r>
+        <w:t xml:space="preserve">        PRINT '======================================================';</w:t>
+      </w:r>
+    </w:p>
+    <w:p>
+      <w:r>
+        <w:t xml:space="preserve">    END TRY</w:t>
+      </w:r>
+    </w:p>
+    <w:p>
+      <w:r>
+        <w:t xml:space="preserve">    BEGIN CATCH</w:t>
+      </w:r>
+    </w:p>
+    <w:p>
+      <w:r>
+        <w:t xml:space="preserve">        IF @@TRANCOUNT &gt; 0 ROLLBACK TRANSACTION;</w:t>
+      </w:r>
+    </w:p>
+    <w:p>
+      <w:r>
+        <w:t xml:space="preserve"/>
+      </w:r>
+    </w:p>
+    <w:p>
+      <w:r>
+        <w:t xml:space="preserve">        PRINT '!! Gold Layer Load Failed';</w:t>
+      </w:r>
+    </w:p>
+    <w:p>
+      <w:r>
+        <w:t xml:space="preserve">        PRINT '!! ' + ERROR_MESSAGE();</w:t>
+      </w:r>
+    </w:p>
+    <w:p>
+      <w:r>
+        <w:t xml:space="preserve">        THROW;</w:t>
+      </w:r>
+    </w:p>
+    <w:p>
+      <w:r>
+        <w:t xml:space="preserve">    END CATCH</w:t>
+      </w:r>
+    </w:p>
+    <w:p>
+      <w:r>
+        <w:t xml:space="preserve">END;</w:t>
+      </w:r>
+    </w:p>
+    <w:p>
+      <w:r>
+        <w:t xml:space="preserve">GO</w:t>
+      </w:r>
+    </w:p>
+    <w:p>
+      <w:r>
+        <w:t xml:space="preserve"/>
+      </w:r>
+    </w:p>
+    <w:p>
+      <w:r>
+        <w:t xml:space="preserve">PRINT 'Procedure gold.load_gold created successfully.';</w:t>
+      </w:r>
+    </w:p>
+    <w:p>
+      <w:r>
+        <w:t xml:space="preserve">PRINT 'Run: EXEC gold.load_gold;';</w:t>
+      </w:r>
+    </w:p>
+    <w:p>
+      <w:pPr>
+        <w:pStyle w:val="Heading2"/>
+      </w:pPr>
+      <w:r>
+        <w:t xml:space="preserve">Appendix C: Scripts/Gold/validate_gold.sql</w:t>
+      </w:r>
+    </w:p>
+    <w:p>
+      <w:r>
+        <w:t xml:space="preserve">/*</w:t>
+      </w:r>
+    </w:p>
+    <w:p>
+      <w:r>
+        <w:t xml:space="preserve">===============================================================================</w:t>
+      </w:r>
+    </w:p>
+    <w:p>
+      <w:r>
+        <w:t xml:space="preserve">Validation Script: validate_gold.sql</w:t>
+      </w:r>
+    </w:p>
+    <w:p>
+      <w:r>
+        <w:t xml:space="preserve">Purpose:    Practical checks for the PD2 Gold Layer before running the official</w:t>
+      </w:r>
+    </w:p>
+    <w:p>
+      <w:r>
+        <w:t xml:space="preserve">            PD2-SubmissionScript-Final.sql audit in SSMS.</w:t>
+      </w:r>
+    </w:p>
+    <w:p>
+      <w:r>
+        <w:t xml:space="preserve">===============================================================================</w:t>
+      </w:r>
+    </w:p>
+    <w:p>
+      <w:r>
+        <w:t xml:space="preserve">*/</w:t>
+      </w:r>
+    </w:p>
+    <w:p>
+      <w:r>
+        <w:t xml:space="preserve"/>
+      </w:r>
+    </w:p>
+    <w:p>
+      <w:r>
+        <w:t xml:space="preserve">USE DataWarehouse;</w:t>
+      </w:r>
+    </w:p>
+    <w:p>
+      <w:r>
+        <w:t xml:space="preserve">GO</w:t>
+      </w:r>
+    </w:p>
+    <w:p>
+      <w:r>
+        <w:t xml:space="preserve"/>
+      </w:r>
+    </w:p>
+    <w:p>
+      <w:r>
+        <w:t xml:space="preserve">PRINT '=============================================================================';</w:t>
+      </w:r>
+    </w:p>
+    <w:p>
+      <w:r>
+        <w:t xml:space="preserve">PRINT ' GOLD LAYER ROW COUNTS';</w:t>
+      </w:r>
+    </w:p>
+    <w:p>
+      <w:r>
+        <w:t xml:space="preserve">PRINT '=============================================================================';</w:t>
+      </w:r>
+    </w:p>
+    <w:p>
+      <w:r>
+        <w:t xml:space="preserve"/>
+      </w:r>
+    </w:p>
+    <w:p>
+      <w:r>
+        <w:t xml:space="preserve">SELECT</w:t>
+      </w:r>
+    </w:p>
+    <w:p>
+      <w:r>
+        <w:t xml:space="preserve">    s.name AS schema_name,</w:t>
+      </w:r>
+    </w:p>
+    <w:p>
+      <w:r>
+        <w:t xml:space="preserve">    t.name AS table_name,</w:t>
+      </w:r>
+    </w:p>
+    <w:p>
+      <w:r>
+        <w:t xml:space="preserve">    SUM(p.rows) AS rows_count</w:t>
+      </w:r>
+    </w:p>
+    <w:p>
+      <w:r>
+        <w:t xml:space="preserve">FROM sys.tables t</w:t>
+      </w:r>
+    </w:p>
+    <w:p>
+      <w:r>
+        <w:t xml:space="preserve">JOIN sys.schemas s</w:t>
+      </w:r>
+    </w:p>
+    <w:p>
+      <w:r>
+        <w:t xml:space="preserve">    ON t.schema_id = s.schema_id</w:t>
+      </w:r>
+    </w:p>
+    <w:p>
+      <w:r>
+        <w:t xml:space="preserve">JOIN sys.partitions p</w:t>
+      </w:r>
+    </w:p>
+    <w:p>
+      <w:r>
+        <w:t xml:space="preserve">    ON t.object_id = p.object_id</w:t>
+      </w:r>
+    </w:p>
+    <w:p>
+      <w:r>
+        <w:t xml:space="preserve">    AND p.index_id IN (0, 1)</w:t>
+      </w:r>
+    </w:p>
+    <w:p>
+      <w:r>
+        <w:t xml:space="preserve">WHERE s.name = 'gold'</w:t>
+      </w:r>
+    </w:p>
+    <w:p>
+      <w:r>
+        <w:t xml:space="preserve">GROUP BY s.name, t.name</w:t>
+      </w:r>
+    </w:p>
+    <w:p>
+      <w:r>
+        <w:t xml:space="preserve">ORDER BY t.name;</w:t>
+      </w:r>
+    </w:p>
+    <w:p>
+      <w:r>
+        <w:t xml:space="preserve"/>
+      </w:r>
+    </w:p>
+    <w:p>
+      <w:r>
+        <w:t xml:space="preserve">PRINT '=============================================================================';</w:t>
+      </w:r>
+    </w:p>
+    <w:p>
+      <w:r>
+        <w:t xml:space="preserve">PRINT ' FACT KEY NULL CHECKS';</w:t>
+      </w:r>
+    </w:p>
+    <w:p>
+      <w:r>
+        <w:t xml:space="preserve">PRINT '=============================================================================';</w:t>
+      </w:r>
+    </w:p>
+    <w:p>
+      <w:r>
+        <w:t xml:space="preserve"/>
+      </w:r>
+    </w:p>
+    <w:p>
+      <w:r>
+        <w:t xml:space="preserve">SELECT</w:t>
+      </w:r>
+    </w:p>
+    <w:p>
+      <w:r>
+        <w:t xml:space="preserve">    'gold.fact_store_sales' AS table_name,</w:t>
+      </w:r>
+    </w:p>
+    <w:p>
+      <w:r>
+        <w:t xml:space="preserve">    SUM(CASE WHEN date_key IS NULL THEN 1 ELSE 0 END) AS date_key_nulls,</w:t>
+      </w:r>
+    </w:p>
+    <w:p>
+      <w:r>
+        <w:t xml:space="preserve">    SUM(CASE WHEN store_key IS NULL THEN 1 ELSE 0 END) AS store_key_nulls,</w:t>
+      </w:r>
+    </w:p>
+    <w:p>
+      <w:r>
+        <w:t xml:space="preserve">    SUM(CASE WHEN product_key IS NULL THEN 1 ELSE 0 END) AS product_key_nulls,</w:t>
+      </w:r>
+    </w:p>
+    <w:p>
+      <w:r>
+        <w:t xml:space="preserve">    SUM(CASE WHEN customer_key IS NULL THEN 1 ELSE 0 END) AS customer_key_nulls,</w:t>
+      </w:r>
+    </w:p>
+    <w:p>
+      <w:r>
+        <w:t xml:space="preserve">    SUM(CASE WHEN employee_key IS NULL THEN 1 ELSE 0 END) AS employee_key_nulls,</w:t>
+      </w:r>
+    </w:p>
+    <w:p>
+      <w:r>
+        <w:t xml:space="preserve">    SUM(CASE WHEN promotion_key IS NULL THEN 1 ELSE 0 END) AS promotion_key_nulls</w:t>
+      </w:r>
+    </w:p>
+    <w:p>
+      <w:r>
+        <w:t xml:space="preserve">FROM gold.fact_store_sales;</w:t>
+      </w:r>
+    </w:p>
+    <w:p>
+      <w:r>
+        <w:t xml:space="preserve"/>
+      </w:r>
+    </w:p>
+    <w:p>
+      <w:r>
+        <w:t xml:space="preserve">SELECT</w:t>
+      </w:r>
+    </w:p>
+    <w:p>
+      <w:r>
+        <w:t xml:space="preserve">    'gold.fact_online_sales' AS table_name,</w:t>
+      </w:r>
+    </w:p>
+    <w:p>
+      <w:r>
+        <w:t xml:space="preserve">    SUM(CASE WHEN date_key IS NULL THEN 1 ELSE 0 END) AS date_key_nulls,</w:t>
+      </w:r>
+    </w:p>
+    <w:p>
+      <w:r>
+        <w:t xml:space="preserve">    SUM(CASE WHEN customer_key IS NULL THEN 1 ELSE 0 END) AS customer_key_nulls,</w:t>
+      </w:r>
+    </w:p>
+    <w:p>
+      <w:r>
+        <w:t xml:space="preserve">    SUM(CASE WHEN product_key IS NULL THEN 1 ELSE 0 END) AS product_key_nulls,</w:t>
+      </w:r>
+    </w:p>
+    <w:p>
+      <w:r>
+        <w:t xml:space="preserve">    SUM(CASE WHEN warehouse_key IS NULL THEN 1 ELSE 0 END) AS warehouse_key_nulls,</w:t>
+      </w:r>
+    </w:p>
+    <w:p>
+      <w:r>
+        <w:t xml:space="preserve">    SUM(CASE WHEN promotion_key IS NULL THEN 1 ELSE 0 END) AS promotion_key_nulls,</w:t>
+      </w:r>
+    </w:p>
+    <w:p>
+      <w:r>
+        <w:t xml:space="preserve">    SUM(CASE WHEN order_status_key IS NULL THEN 1 ELSE 0 END) AS order_status_key_nulls,</w:t>
+      </w:r>
+    </w:p>
+    <w:p>
+      <w:r>
+        <w:t xml:space="preserve">    SUM(CASE WHEN payment_method_key IS NULL THEN 1 ELSE 0 END) AS payment_method_key_nulls</w:t>
+      </w:r>
+    </w:p>
+    <w:p>
+      <w:r>
+        <w:t xml:space="preserve">FROM gold.fact_online_sales;</w:t>
+      </w:r>
+    </w:p>
+    <w:p>
+      <w:r>
+        <w:t xml:space="preserve"/>
+      </w:r>
+    </w:p>
+    <w:p>
+      <w:r>
+        <w:t xml:space="preserve">PRINT '=============================================================================';</w:t>
+      </w:r>
+    </w:p>
+    <w:p>
+      <w:r>
+        <w:t xml:space="preserve">PRINT ' DUPLICATE DIMENSION NATURAL KEY CHECKS';</w:t>
+      </w:r>
+    </w:p>
+    <w:p>
+      <w:r>
+        <w:t xml:space="preserve">PRINT '=============================================================================';</w:t>
+      </w:r>
+    </w:p>
+    <w:p>
+      <w:r>
+        <w:t xml:space="preserve"/>
+      </w:r>
+    </w:p>
+    <w:p>
+      <w:r>
+        <w:t xml:space="preserve">SELECT 'gold.dim_date' AS table_name, full_date AS natural_key, COUNT(*) AS duplicate_count</w:t>
+      </w:r>
+    </w:p>
+    <w:p>
+      <w:r>
+        <w:t xml:space="preserve">FROM gold.dim_date</w:t>
+      </w:r>
+    </w:p>
+    <w:p>
+      <w:r>
+        <w:t xml:space="preserve">GROUP BY full_date</w:t>
+      </w:r>
+    </w:p>
+    <w:p>
+      <w:r>
+        <w:t xml:space="preserve">HAVING COUNT(*) &gt; 1;</w:t>
+      </w:r>
+    </w:p>
+    <w:p>
+      <w:r>
+        <w:t xml:space="preserve"/>
+      </w:r>
+    </w:p>
+    <w:p>
+      <w:r>
+        <w:t xml:space="preserve">SELECT 'gold.dim_customer' AS table_name, customer_id AS natural_key, COUNT(*) AS duplicate_count</w:t>
+      </w:r>
+    </w:p>
+    <w:p>
+      <w:r>
+        <w:t xml:space="preserve">FROM gold.dim_customer</w:t>
+      </w:r>
+    </w:p>
+    <w:p>
+      <w:r>
+        <w:t xml:space="preserve">GROUP BY customer_id</w:t>
+      </w:r>
+    </w:p>
+    <w:p>
+      <w:r>
+        <w:t xml:space="preserve">HAVING COUNT(*) &gt; 1;</w:t>
+      </w:r>
+    </w:p>
+    <w:p>
+      <w:r>
+        <w:t xml:space="preserve"/>
+      </w:r>
+    </w:p>
+    <w:p>
+      <w:r>
+        <w:t xml:space="preserve">SELECT 'gold.dim_product' AS table_name, product_id AS natural_key, COUNT(*) AS duplicate_count</w:t>
+      </w:r>
+    </w:p>
+    <w:p>
+      <w:r>
+        <w:t xml:space="preserve">FROM gold.dim_product</w:t>
+      </w:r>
+    </w:p>
+    <w:p>
+      <w:r>
+        <w:t xml:space="preserve">GROUP BY product_id</w:t>
+      </w:r>
+    </w:p>
+    <w:p>
+      <w:r>
+        <w:t xml:space="preserve">HAVING COUNT(*) &gt; 1;</w:t>
+      </w:r>
+    </w:p>
+    <w:p>
+      <w:r>
+        <w:t xml:space="preserve"/>
+      </w:r>
+    </w:p>
+    <w:p>
+      <w:r>
+        <w:t xml:space="preserve">SELECT 'gold.dim_promotion' AS table_name, promotion_id AS natural_key, COUNT(*) AS duplicate_count</w:t>
+      </w:r>
+    </w:p>
+    <w:p>
+      <w:r>
+        <w:t xml:space="preserve">FROM gold.dim_promotion</w:t>
+      </w:r>
+    </w:p>
+    <w:p>
+      <w:r>
+        <w:t xml:space="preserve">GROUP BY promotion_id</w:t>
+      </w:r>
+    </w:p>
+    <w:p>
+      <w:r>
+        <w:t xml:space="preserve">HAVING COUNT(*) &gt; 1;</w:t>
+      </w:r>
+    </w:p>
+    <w:p>
+      <w:r>
+        <w:t xml:space="preserve"/>
+      </w:r>
+    </w:p>
+    <w:p>
+      <w:r>
+        <w:t xml:space="preserve">SELECT 'gold.dim_store' AS table_name, store_id AS natural_key, COUNT(*) AS duplicate_count</w:t>
+      </w:r>
+    </w:p>
+    <w:p>
+      <w:r>
+        <w:t xml:space="preserve">FROM gold.dim_store</w:t>
+      </w:r>
+    </w:p>
+    <w:p>
+      <w:r>
+        <w:t xml:space="preserve">GROUP BY store_id</w:t>
+      </w:r>
+    </w:p>
+    <w:p>
+      <w:r>
+        <w:t xml:space="preserve">HAVING COUNT(*) &gt; 1;</w:t>
+      </w:r>
+    </w:p>
+    <w:p>
+      <w:r>
+        <w:t xml:space="preserve"/>
+      </w:r>
+    </w:p>
+    <w:p>
+      <w:r>
+        <w:t xml:space="preserve">SELECT 'gold.dim_employee' AS table_name, employee_id AS natural_key, COUNT(*) AS duplicate_count</w:t>
+      </w:r>
+    </w:p>
+    <w:p>
+      <w:r>
+        <w:t xml:space="preserve">FROM gold.dim_employee</w:t>
+      </w:r>
+    </w:p>
+    <w:p>
+      <w:r>
+        <w:t xml:space="preserve">GROUP BY employee_id</w:t>
+      </w:r>
+    </w:p>
+    <w:p>
+      <w:r>
+        <w:t xml:space="preserve">HAVING COUNT(*) &gt; 1;</w:t>
+      </w:r>
+    </w:p>
+    <w:p>
+      <w:r>
+        <w:t xml:space="preserve"/>
+      </w:r>
+    </w:p>
+    <w:p>
+      <w:r>
+        <w:t xml:space="preserve">SELECT 'gold.dim_warehouse' AS table_name, warehouse_id AS natural_key, COUNT(*) AS duplicate_count</w:t>
+      </w:r>
+    </w:p>
+    <w:p>
+      <w:r>
+        <w:t xml:space="preserve">FROM gold.dim_warehouse</w:t>
+      </w:r>
+    </w:p>
+    <w:p>
+      <w:r>
+        <w:t xml:space="preserve">GROUP BY warehouse_id</w:t>
+      </w:r>
+    </w:p>
+    <w:p>
+      <w:r>
+        <w:t xml:space="preserve">HAVING COUNT(*) &gt; 1;</w:t>
+      </w:r>
+    </w:p>
+    <w:p>
+      <w:r>
+        <w:t xml:space="preserve"/>
+      </w:r>
+    </w:p>
+    <w:p>
+      <w:r>
+        <w:t xml:space="preserve">SELECT 'gold.dim_order_status' AS table_name, status_name AS natural_key, COUNT(*) AS duplicate_count</w:t>
+      </w:r>
+    </w:p>
+    <w:p>
+      <w:r>
+        <w:t xml:space="preserve">FROM gold.dim_order_status</w:t>
+      </w:r>
+    </w:p>
+    <w:p>
+      <w:r>
+        <w:t xml:space="preserve">GROUP BY status_name</w:t>
+      </w:r>
+    </w:p>
+    <w:p>
+      <w:r>
+        <w:t xml:space="preserve">HAVING COUNT(*) &gt; 1;</w:t>
+      </w:r>
+    </w:p>
+    <w:p>
+      <w:r>
+        <w:t xml:space="preserve"/>
+      </w:r>
+    </w:p>
+    <w:p>
+      <w:r>
+        <w:t xml:space="preserve">SELECT 'gold.dim_payment_method' AS table_name, payment_method_name AS natural_key, COUNT(*) AS duplicate_count</w:t>
+      </w:r>
+    </w:p>
+    <w:p>
+      <w:r>
+        <w:t xml:space="preserve">FROM gold.dim_payment_method</w:t>
+      </w:r>
+    </w:p>
+    <w:p>
+      <w:r>
+        <w:t xml:space="preserve">GROUP BY payment_method_name</w:t>
+      </w:r>
+    </w:p>
+    <w:p>
+      <w:r>
+        <w:t xml:space="preserve">HAVING COUNT(*) &gt; 1;</w:t>
+      </w:r>
+    </w:p>
+    <w:p>
+      <w:r>
+        <w:t xml:space="preserve"/>
+      </w:r>
+    </w:p>
+    <w:p>
+      <w:r>
+        <w:t xml:space="preserve">PRINT '=============================================================================';</w:t>
+      </w:r>
+    </w:p>
+    <w:p>
+      <w:r>
+        <w:t xml:space="preserve">PRINT ' FACT TO DIMENSION JOIN CHECKS';</w:t>
+      </w:r>
+    </w:p>
+    <w:p>
+      <w:r>
+        <w:t xml:space="preserve">PRINT '=============================================================================';</w:t>
+      </w:r>
+    </w:p>
+    <w:p>
+      <w:r>
+        <w:t xml:space="preserve"/>
+      </w:r>
+    </w:p>
+    <w:p>
+      <w:r>
+        <w:t xml:space="preserve">SELECT</w:t>
+      </w:r>
+    </w:p>
+    <w:p>
+      <w:r>
+        <w:t xml:space="preserve">    'fact_store_sales to all dimensions' AS check_name,</w:t>
+      </w:r>
+    </w:p>
+    <w:p>
+      <w:r>
+        <w:t xml:space="preserve">    COUNT(*) AS orphan_rows</w:t>
+      </w:r>
+    </w:p>
+    <w:p>
+      <w:r>
+        <w:t xml:space="preserve">FROM gold.fact_store_sales f</w:t>
+      </w:r>
+    </w:p>
+    <w:p>
+      <w:r>
+        <w:t xml:space="preserve">LEFT JOIN gold.dim_date d ON f.date_key = d.date_key</w:t>
+      </w:r>
+    </w:p>
+    <w:p>
+      <w:r>
+        <w:t xml:space="preserve">LEFT JOIN gold.dim_store s ON f.store_key = s.store_key</w:t>
+      </w:r>
+    </w:p>
+    <w:p>
+      <w:r>
+        <w:t xml:space="preserve">LEFT JOIN gold.dim_product p ON f.product_key = p.product_key</w:t>
+      </w:r>
+    </w:p>
+    <w:p>
+      <w:r>
+        <w:t xml:space="preserve">LEFT JOIN gold.dim_customer c ON f.customer_key = c.customer_key</w:t>
+      </w:r>
+    </w:p>
+    <w:p>
+      <w:r>
+        <w:t xml:space="preserve">LEFT JOIN gold.dim_employee e ON f.employee_key = e.employee_key</w:t>
+      </w:r>
+    </w:p>
+    <w:p>
+      <w:r>
+        <w:t xml:space="preserve">LEFT JOIN gold.dim_promotion pr ON f.promotion_key = pr.promotion_key</w:t>
+      </w:r>
+    </w:p>
+    <w:p>
+      <w:r>
+        <w:t xml:space="preserve">WHERE d.date_key IS NULL</w:t>
+      </w:r>
+    </w:p>
+    <w:p>
+      <w:r>
+        <w:t xml:space="preserve">   OR s.store_key IS NULL</w:t>
+      </w:r>
+    </w:p>
+    <w:p>
+      <w:r>
+        <w:t xml:space="preserve">   OR p.product_key IS NULL</w:t>
+      </w:r>
+    </w:p>
+    <w:p>
+      <w:r>
+        <w:t xml:space="preserve">   OR c.customer_key IS NULL</w:t>
+      </w:r>
+    </w:p>
+    <w:p>
+      <w:r>
+        <w:t xml:space="preserve">   OR e.employee_key IS NULL</w:t>
+      </w:r>
+    </w:p>
+    <w:p>
+      <w:r>
+        <w:t xml:space="preserve">   OR pr.promotion_key IS NULL;</w:t>
+      </w:r>
+    </w:p>
+    <w:p>
+      <w:r>
+        <w:t xml:space="preserve"/>
+      </w:r>
+    </w:p>
+    <w:p>
+      <w:r>
+        <w:t xml:space="preserve">SELECT</w:t>
+      </w:r>
+    </w:p>
+    <w:p>
+      <w:r>
+        <w:t xml:space="preserve">    'fact_online_sales to all dimensions' AS check_name,</w:t>
+      </w:r>
+    </w:p>
+    <w:p>
+      <w:r>
+        <w:t xml:space="preserve">    COUNT(*) AS orphan_rows</w:t>
+      </w:r>
+    </w:p>
+    <w:p>
+      <w:r>
+        <w:t xml:space="preserve">FROM gold.fact_online_sales f</w:t>
+      </w:r>
+    </w:p>
+    <w:p>
+      <w:r>
+        <w:t xml:space="preserve">LEFT JOIN gold.dim_date d ON f.date_key = d.date_key</w:t>
+      </w:r>
+    </w:p>
+    <w:p>
+      <w:r>
+        <w:t xml:space="preserve">LEFT JOIN gold.dim_customer c ON f.customer_key = c.customer_key</w:t>
+      </w:r>
+    </w:p>
+    <w:p>
+      <w:r>
+        <w:t xml:space="preserve">LEFT JOIN gold.dim_product p ON f.product_key = p.product_key</w:t>
+      </w:r>
+    </w:p>
+    <w:p>
+      <w:r>
+        <w:t xml:space="preserve">LEFT JOIN gold.dim_warehouse w ON f.warehouse_key = w.warehouse_key</w:t>
+      </w:r>
+    </w:p>
+    <w:p>
+      <w:r>
+        <w:t xml:space="preserve">LEFT JOIN gold.dim_promotion pr ON f.promotion_key = pr.promotion_key</w:t>
+      </w:r>
+    </w:p>
+    <w:p>
+      <w:r>
+        <w:t xml:space="preserve">LEFT JOIN gold.dim_order_status os ON f.order_status_key = os.order_status_key</w:t>
+      </w:r>
+    </w:p>
+    <w:p>
+      <w:r>
+        <w:t xml:space="preserve">LEFT JOIN gold.dim_payment_method pm ON f.payment_method_key = pm.payment_method_key</w:t>
+      </w:r>
+    </w:p>
+    <w:p>
+      <w:r>
+        <w:t xml:space="preserve">WHERE d.date_key IS NULL</w:t>
+      </w:r>
+    </w:p>
+    <w:p>
+      <w:r>
+        <w:t xml:space="preserve">   OR c.customer_key IS NULL</w:t>
+      </w:r>
+    </w:p>
+    <w:p>
+      <w:r>
+        <w:t xml:space="preserve">   OR p.product_key IS NULL</w:t>
+      </w:r>
+    </w:p>
+    <w:p>
+      <w:r>
+        <w:t xml:space="preserve">   OR w.warehouse_key IS NULL</w:t>
+      </w:r>
+    </w:p>
+    <w:p>
+      <w:r>
+        <w:t xml:space="preserve">   OR pr.promotion_key IS NULL</w:t>
+      </w:r>
+    </w:p>
+    <w:p>
+      <w:r>
+        <w:t xml:space="preserve">   OR os.order_status_key IS NULL</w:t>
+      </w:r>
+    </w:p>
+    <w:p>
+      <w:r>
+        <w:t xml:space="preserve">   OR pm.payment_method_key IS NULL;</w:t>
+      </w:r>
+    </w:p>
+    <w:p>
+      <w:r>
+        <w:t xml:space="preserve"/>
+      </w:r>
+    </w:p>
+    <w:p>
+      <w:r>
+        <w:t xml:space="preserve">PRINT '=============================================================================';</w:t>
+      </w:r>
+    </w:p>
+    <w:p>
+      <w:r>
+        <w:t xml:space="preserve">PRINT ' SILVER TO GOLD FACT GRAIN CHECKS';</w:t>
+      </w:r>
+    </w:p>
+    <w:p>
+      <w:r>
+        <w:t xml:space="preserve">PRINT '=============================================================================';</w:t>
+      </w:r>
+    </w:p>
+    <w:p>
+      <w:r>
+        <w:t xml:space="preserve"/>
+      </w:r>
+    </w:p>
+    <w:p>
+      <w:r>
+        <w:t xml:space="preserve">SELECT</w:t>
+      </w:r>
+    </w:p>
+    <w:p>
+      <w:r>
+        <w:t xml:space="preserve">    'Store sales line-item grain' AS check_name,</w:t>
+      </w:r>
+    </w:p>
+    <w:p>
+      <w:r>
+        <w:t xml:space="preserve">    (SELECT COUNT(*) FROM silver.transaction_items) AS silver_line_items,</w:t>
+      </w:r>
+    </w:p>
+    <w:p>
+      <w:r>
+        <w:t xml:space="preserve">    (SELECT COUNT(*) FROM gold.fact_store_sales) AS gold_fact_rows;</w:t>
+      </w:r>
+    </w:p>
+    <w:p>
+      <w:r>
+        <w:t xml:space="preserve"/>
+      </w:r>
+    </w:p>
+    <w:p>
+      <w:r>
+        <w:t xml:space="preserve">SELECT</w:t>
+      </w:r>
+    </w:p>
+    <w:p>
+      <w:r>
+        <w:t xml:space="preserve">    'Online sales line-item grain' AS check_name,</w:t>
+      </w:r>
+    </w:p>
+    <w:p>
+      <w:r>
+        <w:t xml:space="preserve">    (SELECT COUNT(*) FROM silver.online_order_items) AS silver_line_items,</w:t>
+      </w:r>
+    </w:p>
+    <w:p>
+      <w:r>
+        <w:t xml:space="preserve">    (SELECT COUNT(*) FROM gold.fact_online_sales) AS gold_fact_rows;</w:t>
+      </w:r>
+    </w:p>
+    <w:p>
+      <w:r>
+        <w:t xml:space="preserve"/>
+      </w:r>
+    </w:p>
+    <w:p>
+      <w:r>
+        <w:t xml:space="preserve">PRINT '=============================================================================';</w:t>
+      </w:r>
+    </w:p>
+    <w:p>
+      <w:r>
+        <w:t xml:space="preserve">PRINT ' CONFORMED DIMENSION CHECK';</w:t>
+      </w:r>
+    </w:p>
+    <w:p>
+      <w:r>
+        <w:t xml:space="preserve">PRINT '=============================================================================';</w:t>
+      </w:r>
+    </w:p>
+    <w:p>
+      <w:r>
+        <w:t xml:space="preserve"/>
+      </w:r>
+    </w:p>
+    <w:p>
+      <w:r>
+        <w:t xml:space="preserve">SELECT</w:t>
+      </w:r>
+    </w:p>
+    <w:p>
+      <w:r>
+        <w:t xml:space="preserve">    ref_tbl.name AS conformed_dimension,</w:t>
+      </w:r>
+    </w:p>
+    <w:p>
+      <w:r>
+        <w:t xml:space="preserve">    COUNT(DISTINCT fact_tbl.name) AS referenced_by_fact_count,</w:t>
+      </w:r>
+    </w:p>
+    <w:p>
+      <w:r>
+        <w:t xml:space="preserve">    STRING_AGG(fact_tbl.name, ', ') AS fact_tables</w:t>
+      </w:r>
+    </w:p>
+    <w:p>
+      <w:r>
+        <w:t xml:space="preserve">FROM sys.foreign_keys fk</w:t>
+      </w:r>
+    </w:p>
+    <w:p>
+      <w:r>
+        <w:t xml:space="preserve">JOIN sys.tables fact_tbl</w:t>
+      </w:r>
+    </w:p>
+    <w:p>
+      <w:r>
+        <w:t xml:space="preserve">    ON fk.parent_object_id = fact_tbl.object_id</w:t>
+      </w:r>
+    </w:p>
+    <w:p>
+      <w:r>
+        <w:t xml:space="preserve">JOIN sys.schemas fact_schema</w:t>
+      </w:r>
+    </w:p>
+    <w:p>
+      <w:r>
+        <w:t xml:space="preserve">    ON fact_tbl.schema_id = fact_schema.schema_id</w:t>
+      </w:r>
+    </w:p>
+    <w:p>
+      <w:r>
+        <w:t xml:space="preserve">JOIN sys.foreign_key_columns fkc</w:t>
+      </w:r>
+    </w:p>
+    <w:p>
+      <w:r>
+        <w:t xml:space="preserve">    ON fk.object_id = fkc.constraint_object_id</w:t>
+      </w:r>
+    </w:p>
+    <w:p>
+      <w:r>
+        <w:t xml:space="preserve">JOIN sys.tables ref_tbl</w:t>
+      </w:r>
+    </w:p>
+    <w:p>
+      <w:r>
+        <w:t xml:space="preserve">    ON fkc.referenced_object_id = ref_tbl.object_id</w:t>
+      </w:r>
+    </w:p>
+    <w:p>
+      <w:r>
+        <w:t xml:space="preserve">WHERE fact_schema.name = 'gold'</w:t>
+      </w:r>
+    </w:p>
+    <w:p>
+      <w:r>
+        <w:t xml:space="preserve">  AND fact_tbl.name LIKE 'fact_%'</w:t>
+      </w:r>
+    </w:p>
+    <w:p>
+      <w:r>
+        <w:t xml:space="preserve">  AND ref_tbl.name LIKE 'dim_%'</w:t>
+      </w:r>
+    </w:p>
+    <w:p>
+      <w:r>
+        <w:t xml:space="preserve">GROUP BY ref_tbl.name</w:t>
+      </w:r>
+    </w:p>
+    <w:p>
+      <w:r>
+        <w:t xml:space="preserve">HAVING COUNT(DISTINCT fact_tbl.name) &gt; 1</w:t>
+      </w:r>
+    </w:p>
+    <w:p>
+      <w:r>
+        <w:t xml:space="preserve">ORDER BY ref_tbl.name;</w:t>
+      </w:r>
+    </w:p>
+    <w:p>
+      <w:r>
+        <w:t xml:space="preserve">GO</w:t>
+      </w:r>
+    </w:p>
     <w:sectPr>
       <w:pgSz w:w="12240" w:h="15840"/>
       <w:pgMar w:top="1440" w:right="1440" w:bottom="1440" w:left="1440" w:header="708" w:footer="708" w:gutter="0"/>

</xml_diff>